<commit_message>
updated markdown and added docs
</commit_message>
<xml_diff>
--- a/Product-Requiremnts-Document-Nis.docx
+++ b/Product-Requiremnts-Document-Nis.docx
@@ -53,11 +53,10 @@
           <w:pPr>
             <w:pStyle w:val="ContentsHeading"/>
             <w:suppressLineNumbers/>
-            <w:bidi w:val="0"/>
             <w:ind w:start="0" w:hanging="0"/>
-            <w:jc w:val="start"/>
             <w:rPr>
-              <w:b/>
+              <w:rFonts w:ascii="FreeSans" w:hAnsi="FreeSans"/>
+              <w:b w:val="false"/>
               <w:b/>
               <w:bCs/>
               <w:sz w:val="32"/>
@@ -66,7 +65,7 @@
           </w:pPr>
           <w:r>
             <w:rPr>
-              <w:b/>
+              <w:b w:val="false"/>
               <w:bCs/>
               <w:sz w:val="32"/>
               <w:szCs w:val="32"/>
@@ -77,8 +76,9 @@
         <w:p>
           <w:pPr>
             <w:pStyle w:val="Contents3"/>
-            <w:bidi w:val="0"/>
-            <w:jc w:val="start"/>
+            <w:tabs>
+              <w:tab w:val="right" w:pos="9638" w:leader="dot"/>
+            </w:tabs>
             <w:rPr/>
           </w:pPr>
           <w:r>
@@ -110,8 +110,9 @@
         <w:p>
           <w:pPr>
             <w:pStyle w:val="Contents3"/>
-            <w:bidi w:val="0"/>
-            <w:jc w:val="start"/>
+            <w:tabs>
+              <w:tab w:val="right" w:pos="9638" w:leader="dot"/>
+            </w:tabs>
             <w:rPr/>
           </w:pPr>
           <w:hyperlink w:anchor="__RefHeading___Toc230_879683452">
@@ -128,8 +129,9 @@
         <w:p>
           <w:pPr>
             <w:pStyle w:val="Contents4"/>
-            <w:bidi w:val="0"/>
-            <w:jc w:val="start"/>
+            <w:tabs>
+              <w:tab w:val="right" w:pos="9638" w:leader="dot"/>
+            </w:tabs>
             <w:rPr/>
           </w:pPr>
           <w:hyperlink w:anchor="__RefHeading___Toc122_879683452">
@@ -146,8 +148,9 @@
         <w:p>
           <w:pPr>
             <w:pStyle w:val="Contents4"/>
-            <w:bidi w:val="0"/>
-            <w:jc w:val="start"/>
+            <w:tabs>
+              <w:tab w:val="right" w:pos="9638" w:leader="dot"/>
+            </w:tabs>
             <w:rPr/>
           </w:pPr>
           <w:hyperlink w:anchor="__RefHeading___Toc232_879683452">
@@ -164,8 +167,9 @@
         <w:p>
           <w:pPr>
             <w:pStyle w:val="Contents4"/>
-            <w:bidi w:val="0"/>
-            <w:jc w:val="start"/>
+            <w:tabs>
+              <w:tab w:val="right" w:pos="9638" w:leader="dot"/>
+            </w:tabs>
             <w:rPr/>
           </w:pPr>
           <w:hyperlink w:anchor="__RefHeading___Toc234_879683452">
@@ -182,8 +186,9 @@
         <w:p>
           <w:pPr>
             <w:pStyle w:val="Contents4"/>
-            <w:bidi w:val="0"/>
-            <w:jc w:val="start"/>
+            <w:tabs>
+              <w:tab w:val="right" w:pos="9638" w:leader="dot"/>
+            </w:tabs>
             <w:rPr/>
           </w:pPr>
           <w:hyperlink w:anchor="__RefHeading___Toc236_879683452">
@@ -200,8 +205,9 @@
         <w:p>
           <w:pPr>
             <w:pStyle w:val="Contents3"/>
-            <w:bidi w:val="0"/>
-            <w:jc w:val="start"/>
+            <w:tabs>
+              <w:tab w:val="right" w:pos="9638" w:leader="dot"/>
+            </w:tabs>
             <w:rPr/>
           </w:pPr>
           <w:hyperlink w:anchor="__RefHeading___Toc238_879683452">
@@ -211,15 +217,16 @@
               </w:rPr>
               <w:t>3. Core Features &amp; Requirements</w:t>
               <w:tab/>
-              <w:t>3</w:t>
+              <w:t>2</w:t>
             </w:r>
           </w:hyperlink>
         </w:p>
         <w:p>
           <w:pPr>
             <w:pStyle w:val="Contents4"/>
-            <w:bidi w:val="0"/>
-            <w:jc w:val="start"/>
+            <w:tabs>
+              <w:tab w:val="right" w:pos="9638" w:leader="dot"/>
+            </w:tabs>
             <w:rPr/>
           </w:pPr>
           <w:hyperlink w:anchor="__RefHeading___Toc240_879683452">
@@ -229,15 +236,16 @@
               </w:rPr>
               <w:t>3.1 Functional Requirements</w:t>
               <w:tab/>
-              <w:t>3</w:t>
+              <w:t>2</w:t>
             </w:r>
           </w:hyperlink>
         </w:p>
         <w:p>
           <w:pPr>
             <w:pStyle w:val="Contents4"/>
-            <w:bidi w:val="0"/>
-            <w:jc w:val="start"/>
+            <w:tabs>
+              <w:tab w:val="right" w:pos="9638" w:leader="dot"/>
+            </w:tabs>
             <w:rPr/>
           </w:pPr>
           <w:hyperlink w:anchor="__RefHeading___Toc242_879683452">
@@ -254,8 +262,9 @@
         <w:p>
           <w:pPr>
             <w:pStyle w:val="Contents3"/>
-            <w:bidi w:val="0"/>
-            <w:jc w:val="start"/>
+            <w:tabs>
+              <w:tab w:val="right" w:pos="9638" w:leader="dot"/>
+            </w:tabs>
             <w:rPr/>
           </w:pPr>
           <w:hyperlink w:anchor="__RefHeading___Toc244_879683452">
@@ -272,8 +281,9 @@
         <w:p>
           <w:pPr>
             <w:pStyle w:val="Contents4"/>
-            <w:bidi w:val="0"/>
-            <w:jc w:val="start"/>
+            <w:tabs>
+              <w:tab w:val="right" w:pos="9638" w:leader="dot"/>
+            </w:tabs>
             <w:rPr/>
           </w:pPr>
           <w:hyperlink w:anchor="__RefHeading___Toc246_879683452">
@@ -290,8 +300,9 @@
         <w:p>
           <w:pPr>
             <w:pStyle w:val="Contents3"/>
-            <w:bidi w:val="0"/>
-            <w:jc w:val="start"/>
+            <w:tabs>
+              <w:tab w:val="right" w:pos="9638" w:leader="dot"/>
+            </w:tabs>
             <w:rPr/>
           </w:pPr>
           <w:hyperlink w:anchor="__RefHeading___Toc248_879683452">
@@ -308,8 +319,9 @@
         <w:p>
           <w:pPr>
             <w:pStyle w:val="Contents4"/>
-            <w:bidi w:val="0"/>
-            <w:jc w:val="start"/>
+            <w:tabs>
+              <w:tab w:val="right" w:pos="9638" w:leader="dot"/>
+            </w:tabs>
             <w:rPr/>
           </w:pPr>
           <w:hyperlink w:anchor="__RefHeading___Toc250_879683452">
@@ -326,8 +338,9 @@
         <w:p>
           <w:pPr>
             <w:pStyle w:val="Contents3"/>
-            <w:bidi w:val="0"/>
-            <w:jc w:val="start"/>
+            <w:tabs>
+              <w:tab w:val="right" w:pos="9638" w:leader="dot"/>
+            </w:tabs>
             <w:rPr/>
           </w:pPr>
           <w:hyperlink w:anchor="__RefHeading___Toc252_879683452">
@@ -344,8 +357,9 @@
         <w:p>
           <w:pPr>
             <w:pStyle w:val="Contents4"/>
-            <w:bidi w:val="0"/>
-            <w:jc w:val="start"/>
+            <w:tabs>
+              <w:tab w:val="right" w:pos="9638" w:leader="dot"/>
+            </w:tabs>
             <w:rPr/>
           </w:pPr>
           <w:hyperlink w:anchor="__RefHeading___Toc254_879683452">
@@ -362,8 +376,9 @@
         <w:p>
           <w:pPr>
             <w:pStyle w:val="Contents4"/>
-            <w:bidi w:val="0"/>
-            <w:jc w:val="start"/>
+            <w:tabs>
+              <w:tab w:val="right" w:pos="9638" w:leader="dot"/>
+            </w:tabs>
             <w:rPr/>
           </w:pPr>
           <w:hyperlink w:anchor="__RefHeading___Toc256_879683452">
@@ -373,15 +388,16 @@
               </w:rPr>
               <w:t>6.2 User Flow</w:t>
               <w:tab/>
-              <w:t>7</w:t>
+              <w:t>8</w:t>
             </w:r>
           </w:hyperlink>
         </w:p>
         <w:p>
           <w:pPr>
             <w:pStyle w:val="Contents3"/>
-            <w:bidi w:val="0"/>
-            <w:jc w:val="start"/>
+            <w:tabs>
+              <w:tab w:val="right" w:pos="9638" w:leader="dot"/>
+            </w:tabs>
             <w:rPr/>
           </w:pPr>
           <w:hyperlink w:anchor="__RefHeading___Toc258_879683452">
@@ -398,8 +414,9 @@
         <w:p>
           <w:pPr>
             <w:pStyle w:val="Contents3"/>
-            <w:bidi w:val="0"/>
-            <w:jc w:val="start"/>
+            <w:tabs>
+              <w:tab w:val="right" w:pos="9638" w:leader="dot"/>
+            </w:tabs>
             <w:rPr/>
           </w:pPr>
           <w:hyperlink w:anchor="__RefHeading___Toc260_879683452">
@@ -416,8 +433,9 @@
         <w:p>
           <w:pPr>
             <w:pStyle w:val="Contents3"/>
-            <w:bidi w:val="0"/>
-            <w:jc w:val="start"/>
+            <w:tabs>
+              <w:tab w:val="right" w:pos="9638" w:leader="dot"/>
+            </w:tabs>
             <w:rPr/>
           </w:pPr>
           <w:hyperlink w:anchor="__RefHeading___Toc262_879683452">
@@ -434,8 +452,9 @@
         <w:p>
           <w:pPr>
             <w:pStyle w:val="Contents4"/>
-            <w:bidi w:val="0"/>
-            <w:jc w:val="start"/>
+            <w:tabs>
+              <w:tab w:val="right" w:pos="9638" w:leader="dot"/>
+            </w:tabs>
             <w:rPr/>
           </w:pPr>
           <w:hyperlink w:anchor="__RefHeading___Toc264_879683452">
@@ -452,16 +471,17 @@
         <w:p>
           <w:pPr>
             <w:pStyle w:val="Contents4"/>
-            <w:bidi w:val="0"/>
-            <w:jc w:val="start"/>
+            <w:tabs>
+              <w:tab w:val="right" w:pos="9638" w:leader="dot"/>
+            </w:tabs>
             <w:rPr/>
           </w:pPr>
-          <w:hyperlink w:anchor="__RefHeading___Toc266_879683452">
+          <w:hyperlink w:anchor="__RefHeading___Toc268_879683452">
             <w:r>
               <w:rPr>
                 <w:rStyle w:val="IndexLink"/>
               </w:rPr>
-              <w:t>Phase 2: Social Media Integration (Weeks 3-4)</w:t>
+              <w:t>Phase 3: Report Generation (Week 3-4)</w:t>
               <w:tab/>
               <w:t>9</w:t>
             </w:r>
@@ -470,16 +490,17 @@
         <w:p>
           <w:pPr>
             <w:pStyle w:val="Contents4"/>
-            <w:bidi w:val="0"/>
-            <w:jc w:val="start"/>
+            <w:tabs>
+              <w:tab w:val="right" w:pos="9638" w:leader="dot"/>
+            </w:tabs>
             <w:rPr/>
           </w:pPr>
-          <w:hyperlink w:anchor="__RefHeading___Toc268_879683452">
+          <w:hyperlink w:anchor="__RefHeading___Toc270_879683452">
             <w:r>
               <w:rPr>
                 <w:rStyle w:val="IndexLink"/>
               </w:rPr>
-              <w:t>Phase 3: Report Generation (Week 5)</w:t>
+              <w:t>Phase 4: Scheduling &amp; Automation (Week 5)</w:t>
               <w:tab/>
               <w:t>9</w:t>
             </w:r>
@@ -488,26 +509,9 @@
         <w:p>
           <w:pPr>
             <w:pStyle w:val="Contents4"/>
-            <w:bidi w:val="0"/>
-            <w:jc w:val="start"/>
-            <w:rPr/>
-          </w:pPr>
-          <w:hyperlink w:anchor="__RefHeading___Toc270_879683452">
-            <w:r>
-              <w:rPr>
-                <w:rStyle w:val="IndexLink"/>
-              </w:rPr>
-              <w:t>Phase 4: Scheduling &amp; Automation (Week 6)</w:t>
-              <w:tab/>
-              <w:t>9</w:t>
-            </w:r>
-          </w:hyperlink>
-        </w:p>
-        <w:p>
-          <w:pPr>
-            <w:pStyle w:val="Contents4"/>
-            <w:bidi w:val="0"/>
-            <w:jc w:val="start"/>
+            <w:tabs>
+              <w:tab w:val="right" w:pos="9638" w:leader="dot"/>
+            </w:tabs>
             <w:rPr/>
           </w:pPr>
           <w:hyperlink w:anchor="__RefHeading___Toc272_879683452">
@@ -515,7 +519,7 @@
               <w:rPr>
                 <w:rStyle w:val="IndexLink"/>
               </w:rPr>
-              <w:t>Phase 5: Testing &amp; Refinement (Weeks 7-8)</w:t>
+              <w:t>Phase 5: Testing &amp; Refinement (Weeks 6-7)</w:t>
               <w:tab/>
               <w:t>9</w:t>
             </w:r>
@@ -524,8 +528,9 @@
         <w:p>
           <w:pPr>
             <w:pStyle w:val="Contents3"/>
-            <w:bidi w:val="0"/>
-            <w:jc w:val="start"/>
+            <w:tabs>
+              <w:tab w:val="right" w:pos="9638" w:leader="dot"/>
+            </w:tabs>
             <w:rPr/>
           </w:pPr>
           <w:hyperlink w:anchor="__RefHeading___Toc274_879683452">
@@ -542,8 +547,9 @@
         <w:p>
           <w:pPr>
             <w:pStyle w:val="Contents3"/>
-            <w:bidi w:val="0"/>
-            <w:jc w:val="start"/>
+            <w:tabs>
+              <w:tab w:val="right" w:pos="9638" w:leader="dot"/>
+            </w:tabs>
             <w:rPr/>
           </w:pPr>
           <w:hyperlink w:anchor="__RefHeading___Toc276_879683452">
@@ -560,8 +566,9 @@
         <w:p>
           <w:pPr>
             <w:pStyle w:val="Contents3"/>
-            <w:bidi w:val="0"/>
-            <w:jc w:val="start"/>
+            <w:tabs>
+              <w:tab w:val="right" w:pos="9638" w:leader="dot"/>
+            </w:tabs>
             <w:rPr/>
           </w:pPr>
           <w:hyperlink w:anchor="__RefHeading___Toc278_879683452">
@@ -578,8 +585,9 @@
         <w:p>
           <w:pPr>
             <w:pStyle w:val="Contents3"/>
-            <w:bidi w:val="0"/>
-            <w:jc w:val="start"/>
+            <w:tabs>
+              <w:tab w:val="right" w:pos="9638" w:leader="dot"/>
+            </w:tabs>
             <w:rPr/>
           </w:pPr>
           <w:hyperlink w:anchor="__RefHeading___Toc280_879683452">
@@ -596,8 +604,9 @@
         <w:p>
           <w:pPr>
             <w:pStyle w:val="Contents4"/>
-            <w:bidi w:val="0"/>
-            <w:jc w:val="start"/>
+            <w:tabs>
+              <w:tab w:val="right" w:pos="9638" w:leader="dot"/>
+            </w:tabs>
             <w:rPr/>
           </w:pPr>
           <w:hyperlink w:anchor="__RefHeading___Toc282_879683452">
@@ -614,8 +623,9 @@
         <w:p>
           <w:pPr>
             <w:pStyle w:val="Contents4"/>
-            <w:bidi w:val="0"/>
-            <w:jc w:val="start"/>
+            <w:tabs>
+              <w:tab w:val="right" w:pos="9638" w:leader="dot"/>
+            </w:tabs>
             <w:rPr/>
           </w:pPr>
           <w:hyperlink w:anchor="__RefHeading___Toc284_879683452">
@@ -836,19 +846,7 @@
         <w:rPr>
           <w:rStyle w:val="StrongEmphasis"/>
         </w:rPr>
-        <w:t>2.</w:t>
-      </w:r>
-      <w:r>
-        <w:rPr>
-          <w:rStyle w:val="StrongEmphasis"/>
-        </w:rPr>
-        <w:t>2</w:t>
-      </w:r>
-      <w:r>
-        <w:rPr>
-          <w:rStyle w:val="StrongEmphasis"/>
-        </w:rPr>
-        <w:t xml:space="preserve"> Product Vision</w:t>
+        <w:t>2.2 Product Vision</w:t>
       </w:r>
     </w:p>
     <w:p>
@@ -867,8 +865,6 @@
     <w:p>
       <w:pPr>
         <w:pStyle w:val="Heading4"/>
-        <w:bidi w:val="0"/>
-        <w:jc w:val="start"/>
         <w:rPr/>
       </w:pPr>
       <w:bookmarkStart w:id="4" w:name="__RefHeading___Toc234_879683452"/>
@@ -883,9 +879,8 @@
         <w:pStyle w:val="TextBody"/>
         <w:numPr>
           <w:ilvl w:val="0"/>
-          <w:numId w:val="26"/>
+          <w:numId w:val="25"/>
         </w:numPr>
-        <w:bidi w:val="0"/>
         <w:rPr/>
       </w:pPr>
       <w:r>
@@ -898,30 +893,13 @@
         <w:pStyle w:val="TextBody"/>
         <w:numPr>
           <w:ilvl w:val="0"/>
-          <w:numId w:val="26"/>
+          <w:numId w:val="25"/>
         </w:numPr>
-        <w:bidi w:val="0"/>
-        <w:rPr/>
-      </w:pPr>
-      <w:r>
-        <w:rPr/>
-        <w:t xml:space="preserve">The report, presented in </w:t>
-      </w:r>
-      <w:r>
-        <w:rPr/>
-        <w:t xml:space="preserve">a </w:t>
-      </w:r>
-      <w:r>
-        <w:rPr/>
-        <w:t xml:space="preserve">form </w:t>
-      </w:r>
-      <w:r>
-        <w:rPr/>
-        <w:t>of a table</w:t>
-      </w:r>
-      <w:r>
-        <w:rPr/>
-        <w:t>, includes columns such as the rolling number of the event, date and time, a short description, the location where the keyword was mentioned, and the sources where the keyword appeared.</w:t>
+        <w:rPr/>
+      </w:pPr>
+      <w:r>
+        <w:rPr/>
+        <w:t>The report, presented in a form of a table, includes columns such as the rolling number of the event, date and time, a short description, the location where the keyword was mentioned, and the sources where the keyword appeared.</w:t>
       </w:r>
     </w:p>
     <w:p>
@@ -929,9 +907,8 @@
         <w:pStyle w:val="TextBody"/>
         <w:numPr>
           <w:ilvl w:val="0"/>
-          <w:numId w:val="26"/>
+          <w:numId w:val="25"/>
         </w:numPr>
-        <w:bidi w:val="0"/>
         <w:rPr/>
       </w:pPr>
       <w:r>
@@ -944,9 +921,8 @@
         <w:pStyle w:val="TextBody"/>
         <w:numPr>
           <w:ilvl w:val="0"/>
-          <w:numId w:val="26"/>
+          <w:numId w:val="25"/>
         </w:numPr>
-        <w:bidi w:val="0"/>
         <w:rPr/>
       </w:pPr>
       <w:r>
@@ -967,19 +943,7 @@
         <w:rPr>
           <w:rStyle w:val="StrongEmphasis"/>
         </w:rPr>
-        <w:t>2.</w:t>
-      </w:r>
-      <w:r>
-        <w:rPr>
-          <w:rStyle w:val="StrongEmphasis"/>
-        </w:rPr>
-        <w:t>4</w:t>
-      </w:r>
-      <w:r>
-        <w:rPr>
-          <w:rStyle w:val="StrongEmphasis"/>
-        </w:rPr>
-        <w:t xml:space="preserve"> Target Users</w:t>
+        <w:t>2.4 Target Users</w:t>
       </w:r>
     </w:p>
     <w:p>
@@ -989,22 +953,11 @@
           <w:ilvl w:val="0"/>
           <w:numId w:val="2"/>
         </w:numPr>
-        <w:tabs>
-          <w:tab w:val="clear" w:pos="709"/>
-          <w:tab w:val="left" w:pos="709" w:leader="none"/>
-        </w:tabs>
-        <w:bidi w:val="0"/>
-        <w:spacing w:before="0" w:after="0"/>
-        <w:ind w:start="709" w:hanging="283"/>
-        <w:rPr/>
-      </w:pPr>
-      <w:r>
-        <w:rPr/>
-        <w:t>Communications tea</w:t>
-      </w:r>
-      <w:r>
-        <w:rPr/>
-        <w:t>m or City of Niš PR professional and city mayor itself</w:t>
+        <w:rPr/>
+      </w:pPr>
+      <w:r>
+        <w:rPr/>
+        <w:t>Communications team or City of Niš PR professional and city mayor itself</w:t>
       </w:r>
     </w:p>
     <w:p>
@@ -1014,13 +967,6 @@
           <w:ilvl w:val="0"/>
           <w:numId w:val="2"/>
         </w:numPr>
-        <w:tabs>
-          <w:tab w:val="clear" w:pos="709"/>
-          <w:tab w:val="left" w:pos="709" w:leader="none"/>
-        </w:tabs>
-        <w:bidi w:val="0"/>
-        <w:spacing w:before="0" w:after="0"/>
-        <w:ind w:start="709" w:hanging="283"/>
         <w:rPr/>
       </w:pPr>
       <w:r>
@@ -1035,22 +981,11 @@
           <w:ilvl w:val="0"/>
           <w:numId w:val="2"/>
         </w:numPr>
-        <w:tabs>
-          <w:tab w:val="clear" w:pos="709"/>
-          <w:tab w:val="left" w:pos="709" w:leader="none"/>
-        </w:tabs>
-        <w:bidi w:val="0"/>
-        <w:spacing w:before="0" w:after="0"/>
-        <w:ind w:start="709" w:hanging="283"/>
-        <w:rPr/>
-      </w:pPr>
-      <w:r>
-        <w:rPr/>
-        <w:t xml:space="preserve">Political organizations </w:t>
-      </w:r>
-      <w:r>
-        <w:rPr/>
-        <w:t>(optional)</w:t>
+        <w:rPr/>
+      </w:pPr>
+      <w:r>
+        <w:rPr/>
+        <w:t>Political organizations (optional)</w:t>
       </w:r>
     </w:p>
     <w:p>
@@ -1060,26 +995,11 @@
           <w:ilvl w:val="0"/>
           <w:numId w:val="2"/>
         </w:numPr>
-        <w:tabs>
-          <w:tab w:val="clear" w:pos="709"/>
-          <w:tab w:val="left" w:pos="709" w:leader="none"/>
-        </w:tabs>
-        <w:bidi w:val="0"/>
-        <w:spacing w:before="0" w:after="0"/>
-        <w:ind w:start="709" w:hanging="283"/>
-        <w:rPr/>
-      </w:pPr>
-      <w:r>
-        <w:rPr/>
-        <w:t xml:space="preserve">Corporate monitoring departments </w:t>
-      </w:r>
-      <w:r>
-        <w:rPr/>
-        <w:t>(optional)</w:t>
-      </w:r>
-      <w:r>
-        <w:rPr/>
-        <w:t xml:space="preserve"> </w:t>
+        <w:rPr/>
+      </w:pPr>
+      <w:r>
+        <w:rPr/>
+        <w:t xml:space="preserve">Corporate monitoring departments (optional) </w:t>
       </w:r>
     </w:p>
     <w:p>
@@ -1089,21 +1009,11 @@
           <w:ilvl w:val="0"/>
           <w:numId w:val="2"/>
         </w:numPr>
-        <w:tabs>
-          <w:tab w:val="clear" w:pos="709"/>
-          <w:tab w:val="left" w:pos="709" w:leader="none"/>
-        </w:tabs>
-        <w:bidi w:val="0"/>
-        <w:ind w:start="709" w:hanging="283"/>
-        <w:rPr/>
-      </w:pPr>
-      <w:r>
-        <w:rPr/>
-        <w:t xml:space="preserve">Research institutions </w:t>
-      </w:r>
-      <w:r>
-        <w:rPr/>
-        <w:t>(optional)</w:t>
+        <w:rPr/>
+      </w:pPr>
+      <w:r>
+        <w:rPr/>
+        <w:t>Research institutions (optional)</w:t>
       </w:r>
     </w:p>
     <w:p>
@@ -1172,7 +1082,6 @@
           <w:numId w:val="3"/>
         </w:numPr>
         <w:tabs>
-          <w:tab w:val="clear" w:pos="709"/>
           <w:tab w:val="left" w:pos="709" w:leader="none"/>
         </w:tabs>
         <w:bidi w:val="0"/>
@@ -1190,23 +1099,7 @@
           <w:b/>
           <w:bCs/>
         </w:rPr>
-        <w:t>mediaportals</w:t>
-      </w:r>
-      <w:r>
-        <w:rPr>
-          <w:rStyle w:val="SourceText"/>
-          <w:b/>
-          <w:bCs/>
-        </w:rPr>
-        <w:t>nis</w:t>
-      </w:r>
-      <w:r>
-        <w:rPr>
-          <w:rStyle w:val="SourceText"/>
-          <w:b/>
-          <w:bCs/>
-        </w:rPr>
-        <w:t>.md</w:t>
+        <w:t>mediaportalsnis.md</w:t>
       </w:r>
       <w:r>
         <w:rPr/>
@@ -1221,7 +1114,6 @@
           <w:numId w:val="3"/>
         </w:numPr>
         <w:tabs>
-          <w:tab w:val="clear" w:pos="709"/>
           <w:tab w:val="left" w:pos="709" w:leader="none"/>
         </w:tabs>
         <w:bidi w:val="0"/>
@@ -1231,23 +1123,7 @@
       </w:pPr>
       <w:r>
         <w:rPr/>
-        <w:t xml:space="preserve">File structure includes: </w:t>
-      </w:r>
-      <w:r>
-        <w:rPr/>
-        <w:t>N</w:t>
-      </w:r>
-      <w:r>
-        <w:rPr/>
-        <w:t xml:space="preserve">ews media </w:t>
-      </w:r>
-      <w:r>
-        <w:rPr/>
-        <w:t xml:space="preserve">priority numbering from the highest priority as number one, Media names and </w:t>
-      </w:r>
-      <w:r>
-        <w:rPr/>
-        <w:t xml:space="preserve">portals URLs  </w:t>
+        <w:t xml:space="preserve">File structure includes: News media priority numbering from the highest priority as number one, Media names and portals URLs  </w:t>
       </w:r>
     </w:p>
     <w:p>
@@ -1258,7 +1134,6 @@
           <w:numId w:val="3"/>
         </w:numPr>
         <w:tabs>
-          <w:tab w:val="clear" w:pos="709"/>
           <w:tab w:val="left" w:pos="709" w:leader="none"/>
         </w:tabs>
         <w:bidi w:val="0"/>
@@ -1290,13 +1165,6 @@
           <w:ilvl w:val="0"/>
           <w:numId w:val="4"/>
         </w:numPr>
-        <w:tabs>
-          <w:tab w:val="clear" w:pos="709"/>
-          <w:tab w:val="left" w:pos="709" w:leader="none"/>
-        </w:tabs>
-        <w:bidi w:val="0"/>
-        <w:spacing w:before="0" w:after="0"/>
-        <w:ind w:start="709" w:hanging="283"/>
         <w:rPr/>
       </w:pPr>
       <w:r>
@@ -1311,13 +1179,6 @@
           <w:ilvl w:val="0"/>
           <w:numId w:val="4"/>
         </w:numPr>
-        <w:tabs>
-          <w:tab w:val="clear" w:pos="709"/>
-          <w:tab w:val="left" w:pos="709" w:leader="none"/>
-        </w:tabs>
-        <w:bidi w:val="0"/>
-        <w:spacing w:before="0" w:after="0"/>
-        <w:ind w:start="709" w:hanging="283"/>
         <w:rPr/>
       </w:pPr>
       <w:r>
@@ -1332,38 +1193,11 @@
           <w:ilvl w:val="1"/>
           <w:numId w:val="4"/>
         </w:numPr>
-        <w:tabs>
-          <w:tab w:val="clear" w:pos="709"/>
-          <w:tab w:val="left" w:pos="1418" w:leader="none"/>
-        </w:tabs>
-        <w:bidi w:val="0"/>
-        <w:spacing w:before="0" w:after="0"/>
-        <w:ind w:start="1418" w:hanging="283"/>
-        <w:rPr/>
-      </w:pPr>
-      <w:r>
-        <w:rPr/>
-        <w:t>Primarily from n</w:t>
-      </w:r>
-      <w:r>
-        <w:rPr/>
-        <w:t xml:space="preserve">ews media portal URLs </w:t>
-      </w:r>
-      <w:r>
-        <w:rPr/>
-        <w:t xml:space="preserve">which are listed in the </w:t>
-      </w:r>
-      <w:r>
-        <w:rPr/>
-        <w:t>second</w:t>
-      </w:r>
-      <w:r>
-        <w:rPr/>
-        <w:t xml:space="preserve"> column</w:t>
-      </w:r>
-      <w:r>
-        <w:rPr/>
-        <w:t xml:space="preserve"> </w:t>
+        <w:rPr/>
+      </w:pPr>
+      <w:r>
+        <w:rPr/>
+        <w:t xml:space="preserve">Primarily from news media portal URLs which are listed in the second column </w:t>
       </w:r>
     </w:p>
     <w:p>
@@ -1373,13 +1207,6 @@
           <w:ilvl w:val="0"/>
           <w:numId w:val="4"/>
         </w:numPr>
-        <w:tabs>
-          <w:tab w:val="clear" w:pos="709"/>
-          <w:tab w:val="left" w:pos="709" w:leader="none"/>
-        </w:tabs>
-        <w:bidi w:val="0"/>
-        <w:spacing w:before="0" w:after="0"/>
-        <w:ind w:start="709" w:hanging="283"/>
         <w:rPr/>
       </w:pPr>
       <w:r>
@@ -1394,13 +1221,6 @@
           <w:ilvl w:val="1"/>
           <w:numId w:val="4"/>
         </w:numPr>
-        <w:tabs>
-          <w:tab w:val="clear" w:pos="709"/>
-          <w:tab w:val="left" w:pos="1418" w:leader="none"/>
-        </w:tabs>
-        <w:bidi w:val="0"/>
-        <w:spacing w:before="0" w:after="0"/>
-        <w:ind w:start="1418" w:hanging="283"/>
         <w:rPr/>
       </w:pPr>
       <w:r>
@@ -1415,13 +1235,6 @@
           <w:ilvl w:val="1"/>
           <w:numId w:val="4"/>
         </w:numPr>
-        <w:tabs>
-          <w:tab w:val="clear" w:pos="709"/>
-          <w:tab w:val="left" w:pos="1418" w:leader="none"/>
-        </w:tabs>
-        <w:bidi w:val="0"/>
-        <w:spacing w:before="0" w:after="0"/>
-        <w:ind w:start="1418" w:hanging="283"/>
         <w:rPr/>
       </w:pPr>
       <w:r>
@@ -1436,13 +1249,6 @@
           <w:ilvl w:val="1"/>
           <w:numId w:val="4"/>
         </w:numPr>
-        <w:tabs>
-          <w:tab w:val="clear" w:pos="709"/>
-          <w:tab w:val="left" w:pos="1418" w:leader="none"/>
-        </w:tabs>
-        <w:bidi w:val="0"/>
-        <w:spacing w:before="0" w:after="0"/>
-        <w:ind w:start="1418" w:hanging="283"/>
         <w:rPr/>
       </w:pPr>
       <w:r>
@@ -1457,13 +1263,6 @@
           <w:ilvl w:val="1"/>
           <w:numId w:val="4"/>
         </w:numPr>
-        <w:tabs>
-          <w:tab w:val="clear" w:pos="709"/>
-          <w:tab w:val="left" w:pos="1418" w:leader="none"/>
-        </w:tabs>
-        <w:bidi w:val="0"/>
-        <w:spacing w:before="0" w:after="0"/>
-        <w:ind w:start="1418" w:hanging="283"/>
         <w:rPr/>
       </w:pPr>
       <w:r>
@@ -1478,12 +1277,6 @@
           <w:ilvl w:val="1"/>
           <w:numId w:val="4"/>
         </w:numPr>
-        <w:tabs>
-          <w:tab w:val="clear" w:pos="709"/>
-          <w:tab w:val="left" w:pos="1418" w:leader="none"/>
-        </w:tabs>
-        <w:bidi w:val="0"/>
-        <w:ind w:start="1418" w:hanging="283"/>
         <w:rPr/>
       </w:pPr>
       <w:r>
@@ -1511,13 +1304,6 @@
           <w:ilvl w:val="0"/>
           <w:numId w:val="5"/>
         </w:numPr>
-        <w:tabs>
-          <w:tab w:val="clear" w:pos="709"/>
-          <w:tab w:val="left" w:pos="709" w:leader="none"/>
-        </w:tabs>
-        <w:bidi w:val="0"/>
-        <w:spacing w:before="0" w:after="0"/>
-        <w:ind w:start="709" w:hanging="283"/>
         <w:rPr/>
       </w:pPr>
       <w:r>
@@ -1538,13 +1324,6 @@
           <w:ilvl w:val="0"/>
           <w:numId w:val="5"/>
         </w:numPr>
-        <w:tabs>
-          <w:tab w:val="clear" w:pos="709"/>
-          <w:tab w:val="left" w:pos="709" w:leader="none"/>
-        </w:tabs>
-        <w:bidi w:val="0"/>
-        <w:spacing w:before="0" w:after="0"/>
-        <w:ind w:start="709" w:hanging="283"/>
         <w:rPr/>
       </w:pPr>
       <w:r>
@@ -1555,11 +1334,7 @@
       </w:r>
       <w:r>
         <w:rPr/>
-        <w:t xml:space="preserve">: Previous 72 hours (for context/comparison) </w:t>
-      </w:r>
-      <w:r>
-        <w:rPr/>
-        <w:t>only on Mondays</w:t>
+        <w:t>: Previous 72 hours (for context/comparison) only on Mondays</w:t>
       </w:r>
     </w:p>
     <w:p>
@@ -1569,12 +1344,48 @@
           <w:ilvl w:val="0"/>
           <w:numId w:val="5"/>
         </w:numPr>
-        <w:tabs>
-          <w:tab w:val="clear" w:pos="709"/>
-          <w:tab w:val="left" w:pos="709" w:leader="none"/>
-        </w:tabs>
-        <w:bidi w:val="0"/>
-        <w:ind w:start="709" w:hanging="283"/>
+        <w:rPr/>
+      </w:pPr>
+      <w:r>
+        <w:rPr>
+          <w:b/>
+          <w:bCs/>
+        </w:rPr>
+        <w:t>Third time-frame</w:t>
+      </w:r>
+      <w:r>
+        <w:rPr/>
+        <w:t>: This option shall allow is to choose time and date for search activities</w:t>
+      </w:r>
+    </w:p>
+    <w:p>
+      <w:pPr>
+        <w:pStyle w:val="TextBody"/>
+        <w:numPr>
+          <w:ilvl w:val="0"/>
+          <w:numId w:val="5"/>
+        </w:numPr>
+        <w:rPr/>
+      </w:pPr>
+      <w:r>
+        <w:rPr>
+          <w:b/>
+          <w:bCs/>
+        </w:rPr>
+        <w:t>Fourth time frame</w:t>
+      </w:r>
+      <w:r>
+        <w:rPr/>
+        <w:t>: This option shall have a button that will perform search in the last 24 hours since search this search button is pressed</w:t>
+      </w:r>
+    </w:p>
+    <w:p>
+      <w:pPr>
+        <w:pStyle w:val="TextBody"/>
+        <w:numPr>
+          <w:ilvl w:val="0"/>
+          <w:numId w:val="5"/>
+        </w:numPr>
         <w:rPr/>
       </w:pPr>
       <w:r>
@@ -1603,7 +1414,6 @@
           <w:numId w:val="6"/>
         </w:numPr>
         <w:tabs>
-          <w:tab w:val="clear" w:pos="709"/>
           <w:tab w:val="left" w:pos="709" w:leader="none"/>
         </w:tabs>
         <w:bidi w:val="0"/>
@@ -1630,7 +1440,6 @@
           <w:numId w:val="6"/>
         </w:numPr>
         <w:tabs>
-          <w:tab w:val="clear" w:pos="709"/>
           <w:tab w:val="left" w:pos="709" w:leader="none"/>
         </w:tabs>
         <w:bidi w:val="0"/>
@@ -1657,7 +1466,6 @@
           <w:numId w:val="6"/>
         </w:numPr>
         <w:tabs>
-          <w:tab w:val="clear" w:pos="709"/>
           <w:tab w:val="left" w:pos="709" w:leader="none"/>
         </w:tabs>
         <w:bidi w:val="0"/>
@@ -1666,11 +1474,7 @@
       </w:pPr>
       <w:r>
         <w:rPr/>
-        <w:t xml:space="preserve">Post-06:00 AM activation focuses on current day's data </w:t>
-      </w:r>
-      <w:r>
-        <w:rPr/>
-        <w:t>from 06:00 AM on the current day</w:t>
+        <w:t>Post-06:00 AM activation focuses on current day's data from 06:00 AM on the current day</w:t>
       </w:r>
     </w:p>
     <w:p>
@@ -1694,7 +1498,6 @@
           <w:numId w:val="7"/>
         </w:numPr>
         <w:tabs>
-          <w:tab w:val="clear" w:pos="709"/>
           <w:tab w:val="left" w:pos="709" w:leader="none"/>
         </w:tabs>
         <w:bidi w:val="0"/>
@@ -1704,11 +1507,7 @@
       </w:pPr>
       <w:r>
         <w:rPr/>
-        <w:t xml:space="preserve">Generate email-ready Markdown format reports </w:t>
-      </w:r>
-      <w:r>
-        <w:rPr/>
-        <w:t>in a table overview</w:t>
+        <w:t>Generate email-ready Markdown format reports in a table overview</w:t>
       </w:r>
     </w:p>
     <w:p>
@@ -1719,7 +1518,6 @@
           <w:numId w:val="7"/>
         </w:numPr>
         <w:tabs>
-          <w:tab w:val="clear" w:pos="709"/>
           <w:tab w:val="left" w:pos="709" w:leader="none"/>
         </w:tabs>
         <w:bidi w:val="0"/>
@@ -1750,11 +1548,7 @@
       </w:pPr>
       <w:r>
         <w:rPr/>
-        <w:t>Short e</w:t>
-      </w:r>
-      <w:r>
-        <w:rPr/>
-        <w:t xml:space="preserve">xecutive summary </w:t>
+        <w:t xml:space="preserve">Short executive summary </w:t>
       </w:r>
     </w:p>
     <w:p>
@@ -1817,39 +1611,7 @@
       </w:pPr>
       <w:r>
         <w:rPr/>
-        <w:t xml:space="preserve">Time-frame segmentation </w:t>
-      </w:r>
-      <w:r>
-        <w:rPr/>
-        <w:t xml:space="preserve">in </w:t>
-      </w:r>
-      <w:r>
-        <w:rPr/>
-        <w:t xml:space="preserve">24h </w:t>
-      </w:r>
-      <w:r>
-        <w:rPr/>
-        <w:t>and</w:t>
-      </w:r>
-      <w:r>
-        <w:rPr/>
-        <w:t xml:space="preserve"> 72h</w:t>
-      </w:r>
-      <w:r>
-        <w:rPr/>
-        <w:t xml:space="preserve">(optional </w:t>
-      </w:r>
-      <w:r>
-        <w:rPr/>
-        <w:t>for Mondays</w:t>
-      </w:r>
-      <w:r>
-        <w:rPr/>
-        <w:t>)</w:t>
-      </w:r>
-      <w:r>
-        <w:rPr/>
-        <w:t xml:space="preserve"> </w:t>
+        <w:t xml:space="preserve">Time-frame segmentation in 24h and 72h(optional for Mondays) </w:t>
       </w:r>
     </w:p>
     <w:p>
@@ -1870,11 +1632,7 @@
       </w:pPr>
       <w:r>
         <w:rPr/>
-        <w:t xml:space="preserve">Direct links to all sources </w:t>
-      </w:r>
-      <w:r>
-        <w:rPr/>
-        <w:t>with the exact news title</w:t>
+        <w:t>Direct links to all sources with the exact news title</w:t>
       </w:r>
     </w:p>
     <w:p>
@@ -1918,7 +1676,6 @@
           <w:numId w:val="8"/>
         </w:numPr>
         <w:tabs>
-          <w:tab w:val="clear" w:pos="709"/>
           <w:tab w:val="left" w:pos="709" w:leader="none"/>
         </w:tabs>
         <w:bidi w:val="0"/>
@@ -1939,7 +1696,6 @@
           <w:numId w:val="8"/>
         </w:numPr>
         <w:tabs>
-          <w:tab w:val="clear" w:pos="709"/>
           <w:tab w:val="left" w:pos="709" w:leader="none"/>
         </w:tabs>
         <w:bidi w:val="0"/>
@@ -1972,7 +1728,6 @@
           <w:numId w:val="8"/>
         </w:numPr>
         <w:tabs>
-          <w:tab w:val="clear" w:pos="709"/>
           <w:tab w:val="left" w:pos="709" w:leader="none"/>
         </w:tabs>
         <w:bidi w:val="0"/>
@@ -1993,7 +1748,6 @@
           <w:numId w:val="8"/>
         </w:numPr>
         <w:tabs>
-          <w:tab w:val="clear" w:pos="709"/>
           <w:tab w:val="left" w:pos="709" w:leader="none"/>
         </w:tabs>
         <w:bidi w:val="0"/>
@@ -2055,7 +1809,6 @@
           <w:numId w:val="9"/>
         </w:numPr>
         <w:tabs>
-          <w:tab w:val="clear" w:pos="709"/>
           <w:tab w:val="left" w:pos="709" w:leader="none"/>
         </w:tabs>
         <w:bidi w:val="0"/>
@@ -2086,7 +1839,6 @@
           <w:numId w:val="9"/>
         </w:numPr>
         <w:tabs>
-          <w:tab w:val="clear" w:pos="709"/>
           <w:tab w:val="left" w:pos="709" w:leader="none"/>
         </w:tabs>
         <w:bidi w:val="0"/>
@@ -2117,7 +1869,6 @@
           <w:numId w:val="9"/>
         </w:numPr>
         <w:tabs>
-          <w:tab w:val="clear" w:pos="709"/>
           <w:tab w:val="left" w:pos="709" w:leader="none"/>
         </w:tabs>
         <w:bidi w:val="0"/>
@@ -2162,7 +1913,6 @@
           <w:numId w:val="10"/>
         </w:numPr>
         <w:tabs>
-          <w:tab w:val="clear" w:pos="709"/>
           <w:tab w:val="left" w:pos="709" w:leader="none"/>
         </w:tabs>
         <w:bidi w:val="0"/>
@@ -2172,11 +1922,7 @@
       </w:pPr>
       <w:r>
         <w:rPr/>
-        <w:t xml:space="preserve">Research agent module </w:t>
-      </w:r>
-      <w:r>
-        <w:rPr/>
-        <w:t>with UX/UI build in Streamlit Python library</w:t>
+        <w:t>Research agent module with UX/UI build in Streamlit Python library</w:t>
       </w:r>
     </w:p>
     <w:p>
@@ -2187,7 +1933,6 @@
           <w:numId w:val="10"/>
         </w:numPr>
         <w:tabs>
-          <w:tab w:val="clear" w:pos="709"/>
           <w:tab w:val="left" w:pos="709" w:leader="none"/>
         </w:tabs>
         <w:bidi w:val="0"/>
@@ -2197,11 +1942,7 @@
       </w:pPr>
       <w:r>
         <w:rPr/>
-        <w:t xml:space="preserve">Web scraping module </w:t>
-      </w:r>
-      <w:r>
-        <w:rPr/>
-        <w:t>using tools such as</w:t>
+        <w:t>Web scraping module using tools such as</w:t>
       </w:r>
     </w:p>
     <w:p>
@@ -2247,23 +1988,7 @@
           <w:b/>
           <w:bCs/>
         </w:rPr>
-        <w:t>`mediaportalsni</w:t>
-      </w:r>
-      <w:r>
-        <w:rPr>
-          <w:rFonts w:ascii="Liberation Mono" w:hAnsi="Liberation Mono"/>
-          <w:b/>
-          <w:bCs/>
-        </w:rPr>
-        <w:t>s</w:t>
-      </w:r>
-      <w:r>
-        <w:rPr>
-          <w:rFonts w:ascii="Liberation Mono" w:hAnsi="Liberation Mono"/>
-          <w:b/>
-          <w:bCs/>
-        </w:rPr>
-        <w:t>.md`</w:t>
+        <w:t>`mediaportalsnis.md`</w:t>
       </w:r>
       <w:r>
         <w:rPr/>
@@ -2278,7 +2003,6 @@
           <w:numId w:val="10"/>
         </w:numPr>
         <w:tabs>
-          <w:tab w:val="clear" w:pos="709"/>
           <w:tab w:val="left" w:pos="709" w:leader="none"/>
         </w:tabs>
         <w:bidi w:val="0"/>
@@ -2299,7 +2023,6 @@
           <w:numId w:val="10"/>
         </w:numPr>
         <w:tabs>
-          <w:tab w:val="clear" w:pos="709"/>
           <w:tab w:val="left" w:pos="709" w:leader="none"/>
         </w:tabs>
         <w:bidi w:val="0"/>
@@ -2320,7 +2043,6 @@
           <w:numId w:val="10"/>
         </w:numPr>
         <w:tabs>
-          <w:tab w:val="clear" w:pos="709"/>
           <w:tab w:val="left" w:pos="709" w:leader="none"/>
         </w:tabs>
         <w:bidi w:val="0"/>
@@ -2341,7 +2063,6 @@
           <w:numId w:val="10"/>
         </w:numPr>
         <w:tabs>
-          <w:tab w:val="clear" w:pos="709"/>
           <w:tab w:val="left" w:pos="709" w:leader="none"/>
         </w:tabs>
         <w:bidi w:val="0"/>
@@ -2374,7 +2095,6 @@
           <w:numId w:val="11"/>
         </w:numPr>
         <w:tabs>
-          <w:tab w:val="clear" w:pos="709"/>
           <w:tab w:val="left" w:pos="709" w:leader="none"/>
         </w:tabs>
         <w:bidi w:val="0"/>
@@ -2403,7 +2123,6 @@
           <w:numId w:val="11"/>
         </w:numPr>
         <w:tabs>
-          <w:tab w:val="clear" w:pos="709"/>
           <w:tab w:val="left" w:pos="709" w:leader="none"/>
         </w:tabs>
         <w:bidi w:val="0"/>
@@ -2413,11 +2132,7 @@
       </w:pPr>
       <w:r>
         <w:rPr/>
-        <w:t>C</w:t>
-      </w:r>
-      <w:r>
-        <w:rPr/>
-        <w:t xml:space="preserve">onsider </w:t>
+        <w:t xml:space="preserve">Consider </w:t>
       </w:r>
       <w:r>
         <w:rPr>
@@ -2429,15 +2144,7 @@
       </w:r>
       <w:r>
         <w:rPr/>
-        <w:t>database with login and history data</w:t>
-      </w:r>
-      <w:r>
-        <w:rPr/>
-        <w:t xml:space="preserve"> </w:t>
-      </w:r>
-      <w:r>
-        <w:rPr/>
-        <w:t>collected in previous iterations</w:t>
+        <w:t>database with login and history data collected in previous iterations</w:t>
       </w:r>
     </w:p>
     <w:p>
@@ -2448,7 +2155,6 @@
           <w:numId w:val="11"/>
         </w:numPr>
         <w:tabs>
-          <w:tab w:val="clear" w:pos="709"/>
           <w:tab w:val="left" w:pos="709" w:leader="none"/>
         </w:tabs>
         <w:bidi w:val="0"/>
@@ -2469,7 +2175,6 @@
           <w:numId w:val="11"/>
         </w:numPr>
         <w:tabs>
-          <w:tab w:val="clear" w:pos="709"/>
           <w:tab w:val="left" w:pos="709" w:leader="none"/>
         </w:tabs>
         <w:bidi w:val="0"/>
@@ -2490,7 +2195,6 @@
           <w:numId w:val="11"/>
         </w:numPr>
         <w:tabs>
-          <w:tab w:val="clear" w:pos="709"/>
           <w:tab w:val="left" w:pos="709" w:leader="none"/>
         </w:tabs>
         <w:bidi w:val="0"/>
@@ -2527,7 +2231,6 @@
           <w:numId w:val="12"/>
         </w:numPr>
         <w:tabs>
-          <w:tab w:val="clear" w:pos="709"/>
           <w:tab w:val="left" w:pos="709" w:leader="none"/>
         </w:tabs>
         <w:bidi w:val="0"/>
@@ -2548,7 +2251,6 @@
           <w:numId w:val="12"/>
         </w:numPr>
         <w:tabs>
-          <w:tab w:val="clear" w:pos="709"/>
           <w:tab w:val="left" w:pos="709" w:leader="none"/>
         </w:tabs>
         <w:bidi w:val="0"/>
@@ -2558,29 +2260,14 @@
       </w:pPr>
       <w:r>
         <w:rPr/>
-        <w:t xml:space="preserve">Web scraping </w:t>
-      </w:r>
-      <w:r>
-        <w:rPr/>
-        <w:t xml:space="preserve">news media web portals </w:t>
-      </w:r>
-      <w:r>
-        <w:rPr/>
-        <w:t xml:space="preserve">infrastructure with </w:t>
+        <w:t xml:space="preserve">Web scraping news media web portals infrastructure with </w:t>
       </w:r>
       <w:r>
         <w:rPr>
           <w:b/>
           <w:bCs/>
         </w:rPr>
-        <w:t xml:space="preserve">rate limiting </w:t>
-      </w:r>
-      <w:r>
-        <w:rPr>
-          <w:b/>
-          <w:bCs/>
-        </w:rPr>
-        <w:t>if applicable</w:t>
+        <w:t>rate limiting if applicable</w:t>
       </w:r>
       <w:r>
         <w:rPr/>
@@ -2595,7 +2282,6 @@
           <w:numId w:val="12"/>
         </w:numPr>
         <w:tabs>
-          <w:tab w:val="clear" w:pos="709"/>
           <w:tab w:val="left" w:pos="709" w:leader="none"/>
         </w:tabs>
         <w:bidi w:val="0"/>
@@ -2628,7 +2314,6 @@
           <w:numId w:val="13"/>
         </w:numPr>
         <w:tabs>
-          <w:tab w:val="clear" w:pos="709"/>
           <w:tab w:val="left" w:pos="709" w:leader="none"/>
         </w:tabs>
         <w:bidi w:val="0"/>
@@ -2649,7 +2334,6 @@
           <w:numId w:val="13"/>
         </w:numPr>
         <w:tabs>
-          <w:tab w:val="clear" w:pos="709"/>
           <w:tab w:val="left" w:pos="709" w:leader="none"/>
         </w:tabs>
         <w:bidi w:val="0"/>
@@ -2670,7 +2354,6 @@
           <w:numId w:val="13"/>
         </w:numPr>
         <w:tabs>
-          <w:tab w:val="clear" w:pos="709"/>
           <w:tab w:val="left" w:pos="709" w:leader="none"/>
         </w:tabs>
         <w:bidi w:val="0"/>
@@ -2691,7 +2374,6 @@
           <w:numId w:val="13"/>
         </w:numPr>
         <w:tabs>
-          <w:tab w:val="clear" w:pos="709"/>
           <w:tab w:val="left" w:pos="709" w:leader="none"/>
         </w:tabs>
         <w:bidi w:val="0"/>
@@ -2773,7 +2455,7 @@
         <w:rPr>
           <w:rStyle w:val="SourceText"/>
         </w:rPr>
-        <w:t>You are an AI Press Clipping Research Agent specialized in media monitoring and intelligence gathering. You function as an automated journalist and analyst, tasked with comprehensively tracking news coverage and social media discussions across prioritized media sources.</w:t>
+        <w:t>You are an AI Press Clipping Research Agent specialized in media monitoring and intelligence gathering. You function as an automated journalist and analyst, tasked with comprehensively tracking news coverage sources.</w:t>
       </w:r>
     </w:p>
     <w:p>
@@ -2830,64 +2512,22 @@
         <w:rPr>
           <w:rStyle w:val="SourceText"/>
         </w:rPr>
-        <w:t xml:space="preserve">1. Monitor, </w:t>
-      </w:r>
-      <w:r>
-        <w:rPr>
-          <w:rStyle w:val="SourceText"/>
-        </w:rPr>
-        <w:t xml:space="preserve">fetch and </w:t>
-      </w:r>
-      <w:r>
-        <w:rPr>
-          <w:rStyle w:val="SourceText"/>
-        </w:rPr>
-        <w:t>scrape content from specified news media portals and their associated social media accounts</w:t>
-      </w:r>
-    </w:p>
-    <w:p>
-      <w:pPr>
-        <w:pStyle w:val="PreformattedText"/>
-        <w:bidi w:val="0"/>
-        <w:spacing w:before="0" w:after="0"/>
-        <w:jc w:val="start"/>
-        <w:rPr/>
-      </w:pPr>
-      <w:r>
-        <w:rPr>
-          <w:rStyle w:val="SourceText"/>
-        </w:rPr>
-        <w:t>2. **</w:t>
-      </w:r>
-      <w:r>
-        <w:rPr>
-          <w:rStyle w:val="SourceText"/>
-        </w:rPr>
-        <w:t>Based on the date and time posted**, s</w:t>
-      </w:r>
-      <w:r>
-        <w:rPr>
-          <w:rStyle w:val="SourceText"/>
-        </w:rPr>
-        <w:t xml:space="preserve">earch for predefined terms across all sources within specified time-frames </w:t>
-      </w:r>
-      <w:r>
-        <w:rPr>
-          <w:rStyle w:val="SourceText"/>
-        </w:rPr>
-        <w:t xml:space="preserve">of the last </w:t>
-      </w:r>
-      <w:r>
-        <w:rPr>
-          <w:rStyle w:val="SourceText"/>
-        </w:rPr>
-        <w:t xml:space="preserve">24h and 72h </w:t>
-      </w:r>
-      <w:r>
-        <w:rPr>
-          <w:rStyle w:val="SourceText"/>
-        </w:rPr>
-        <w:t>only on Mondays</w:t>
+        <w:t>1. Monitor, fetch and scrape content from specified news media portals</w:t>
+      </w:r>
+    </w:p>
+    <w:p>
+      <w:pPr>
+        <w:pStyle w:val="PreformattedText"/>
+        <w:bidi w:val="0"/>
+        <w:spacing w:before="0" w:after="0"/>
+        <w:jc w:val="start"/>
+        <w:rPr/>
+      </w:pPr>
+      <w:r>
+        <w:rPr>
+          <w:rStyle w:val="SourceText"/>
+        </w:rPr>
+        <w:t>2. **Based on the date and time posted**, search for predefined terms across all sources within specified time-frames of the last 24h and 72h only on Mondays</w:t>
       </w:r>
     </w:p>
     <w:p>
@@ -3004,31 +2644,7 @@
         <w:rPr>
           <w:rStyle w:val="SourceText"/>
         </w:rPr>
-        <w:t xml:space="preserve">- **Data Source**: `mediaportalsnis.md` </w:t>
-      </w:r>
-      <w:r>
-        <w:rPr>
-          <w:rStyle w:val="SourceText"/>
-        </w:rPr>
-        <w:t>file</w:t>
-      </w:r>
-      <w:r>
-        <w:rPr>
-          <w:rStyle w:val="SourceText"/>
-        </w:rPr>
-        <w:t xml:space="preserve">, </w:t>
-      </w:r>
-      <w:r>
-        <w:rPr>
-          <w:rStyle w:val="SourceText"/>
-        </w:rPr>
-        <w:t xml:space="preserve">`Product-Requirements-Document.pdf` file, and web sites links </w:t>
-      </w:r>
-      <w:r>
-        <w:rPr>
-          <w:rStyle w:val="SourceText"/>
-        </w:rPr>
-        <w:t>file containing prioritized tables of:</w:t>
+        <w:t>- **Data Source**: `mediaportalsnis.md` file, `Product-Requirements-Document.pdf` file, and web sites links file containing prioritized tables of:</w:t>
       </w:r>
     </w:p>
     <w:p>
@@ -3049,19 +2665,7 @@
         <w:rPr>
           <w:rStyle w:val="SourceText"/>
         </w:rPr>
-        <w:t xml:space="preserve">- </w:t>
-      </w:r>
-      <w:r>
-        <w:rPr>
-          <w:rStyle w:val="SourceText"/>
-        </w:rPr>
-        <w:t>The</w:t>
-      </w:r>
-      <w:r>
-        <w:rPr>
-          <w:rStyle w:val="SourceText"/>
-        </w:rPr>
-        <w:t xml:space="preserve"> news media portals (URLs + social media accounts)</w:t>
+        <w:t>- The news media portals (URLs)</w:t>
       </w:r>
     </w:p>
     <w:p>
@@ -3112,19 +2716,7 @@
         <w:rPr>
           <w:rStyle w:val="SourceText"/>
         </w:rPr>
-        <w:t xml:space="preserve">- Primary: </w:t>
-      </w:r>
-      <w:r>
-        <w:rPr>
-          <w:rStyle w:val="SourceText"/>
-        </w:rPr>
-        <w:t xml:space="preserve">The </w:t>
-      </w:r>
-      <w:r>
-        <w:rPr>
-          <w:rStyle w:val="SourceText"/>
-        </w:rPr>
-        <w:t>Last 24 hours (main focus for daily reports)</w:t>
+        <w:t>- Primary: The Last 24 hours (main focus for daily reports)</w:t>
       </w:r>
     </w:p>
     <w:p>
@@ -3145,40 +2737,22 @@
         <w:rPr>
           <w:rStyle w:val="SourceText"/>
         </w:rPr>
-        <w:t xml:space="preserve">- Secondary: Previous 72 hours </w:t>
-      </w:r>
-      <w:r>
-        <w:rPr>
-          <w:rStyle w:val="SourceText"/>
-        </w:rPr>
-        <w:t>only on Mondays</w:t>
-      </w:r>
-      <w:r>
-        <w:rPr>
-          <w:rStyle w:val="SourceText"/>
-        </w:rPr>
-        <w:t>(contextual reference)</w:t>
-      </w:r>
-    </w:p>
-    <w:p>
-      <w:pPr>
-        <w:pStyle w:val="PreformattedText"/>
-        <w:bidi w:val="0"/>
-        <w:spacing w:before="0" w:after="0"/>
-        <w:jc w:val="start"/>
-        <w:rPr/>
-      </w:pPr>
-      <w:r>
-        <w:rPr>
-          <w:rStyle w:val="SourceText"/>
-        </w:rPr>
-        <w:t xml:space="preserve">- **Search Terms**: Configurable list of keywords, phrases, organization names, or topics to monitor, </w:t>
-      </w:r>
-      <w:r>
-        <w:rPr>
-          <w:rStyle w:val="SourceText"/>
-        </w:rPr>
-        <w:t>adding option to be hard-coded or edited in the search bar</w:t>
+        <w:t>- Secondary: Previous 72 hours only on Mondays(contextual reference)</w:t>
+      </w:r>
+    </w:p>
+    <w:p>
+      <w:pPr>
+        <w:pStyle w:val="PreformattedText"/>
+        <w:bidi w:val="0"/>
+        <w:spacing w:before="0" w:after="0"/>
+        <w:jc w:val="start"/>
+        <w:rPr/>
+      </w:pPr>
+      <w:r>
+        <w:rPr>
+          <w:rStyle w:val="SourceText"/>
+        </w:rPr>
+        <w:t>- **Search Terms**: Configurable list of keywords, phrases, organization names, or topics to monitor, adding option to be hard-coded or edited in the search bar</w:t>
       </w:r>
     </w:p>
     <w:p>
@@ -3595,19 +3169,7 @@
         <w:rPr>
           <w:rStyle w:val="SourceText"/>
         </w:rPr>
-        <w:t xml:space="preserve">Generate a Markdown-formatted report </w:t>
-      </w:r>
-      <w:r>
-        <w:rPr>
-          <w:rStyle w:val="SourceText"/>
-        </w:rPr>
-        <w:t xml:space="preserve">in **professional Serbian language** using **Latin characters** </w:t>
-      </w:r>
-      <w:r>
-        <w:rPr>
-          <w:rStyle w:val="SourceText"/>
-        </w:rPr>
-        <w:t>with the following structure:</w:t>
+        <w:t>Generate a Markdown-formatted report in **professional Serbian language** using **Latin characters** with the following structure:</w:t>
       </w:r>
     </w:p>
     <w:p>
@@ -4276,19 +3838,7 @@
         <w:rPr>
           <w:rStyle w:val="SourceText"/>
         </w:rPr>
-        <w:t xml:space="preserve">- Both time-frames (24h and 72h </w:t>
-      </w:r>
-      <w:r>
-        <w:rPr>
-          <w:rStyle w:val="SourceText"/>
-        </w:rPr>
-        <w:t>on Mondays</w:t>
-      </w:r>
-      <w:r>
-        <w:rPr>
-          <w:rStyle w:val="SourceText"/>
-        </w:rPr>
-        <w:t>) have been searched</w:t>
+        <w:t>- Both time-frames (24h and 72h on Mondays) have been searched</w:t>
       </w:r>
     </w:p>
     <w:p>
@@ -4650,19 +4200,7 @@
         <w:rPr>
           <w:rStyle w:val="StrongEmphasis"/>
         </w:rPr>
-        <w:t xml:space="preserve">5. </w:t>
-      </w:r>
-      <w:r>
-        <w:rPr>
-          <w:rStyle w:val="StrongEmphasis"/>
-        </w:rPr>
-        <w:t xml:space="preserve">Report </w:t>
-      </w:r>
-      <w:r>
-        <w:rPr>
-          <w:rStyle w:val="StrongEmphasis"/>
-        </w:rPr>
-        <w:t>Data Schema</w:t>
+        <w:t>5. Report Data Schema</w:t>
       </w:r>
     </w:p>
     <w:p>
@@ -4678,25 +4216,7 @@
         <w:rPr>
           <w:rStyle w:val="StrongEmphasis"/>
         </w:rPr>
-        <w:t xml:space="preserve">5.1 </w:t>
-      </w:r>
-      <w:r>
-        <w:rPr>
-          <w:rStyle w:val="StrongEmphasis"/>
-        </w:rPr>
-        <w:t>Table</w:t>
-      </w:r>
-      <w:r>
-        <w:rPr>
-          <w:rStyle w:val="StrongEmphasis"/>
-        </w:rPr>
-        <w:t xml:space="preserve"> Structure </w:t>
-      </w:r>
-      <w:r>
-        <w:rPr>
-          <w:rStyle w:val="StrongEmphasis"/>
-        </w:rPr>
-        <w:t>of The Main Report</w:t>
+        <w:t>5.1 Table Structure of The Main Report</w:t>
       </w:r>
     </w:p>
     <w:p>
@@ -4729,7 +4249,11 @@
         </w:rPr>
       </w:pPr>
       <w:r>
-        <w:rPr/>
+        <w:rPr>
+          <w:rFonts w:ascii="FreeSans" w:hAnsi="FreeSans"/>
+          <w:sz w:val="24"/>
+          <w:szCs w:val="24"/>
+        </w:rPr>
       </w:r>
     </w:p>
     <w:p>
@@ -4941,11 +4465,7 @@
       <w:bookmarkEnd w:id="13"/>
       <w:r>
         <w:rPr/>
-        <w:t xml:space="preserve">6. </w:t>
-      </w:r>
-      <w:r>
-        <w:rPr/>
-        <w:t>User Interactions and Design</w:t>
+        <w:t>6. User Interactions and Design</w:t>
       </w:r>
     </w:p>
     <w:p>
@@ -4960,6 +4480,165 @@
       <w:r>
         <w:rPr/>
         <w:t>6.1 Wire-frames and Mock-ups</w:t>
+      </w:r>
+    </w:p>
+    <w:p>
+      <w:pPr>
+        <w:pStyle w:val="TextBody"/>
+        <w:numPr>
+          <w:ilvl w:val="0"/>
+          <w:numId w:val="26"/>
+        </w:numPr>
+        <w:bidi w:val="0"/>
+        <w:spacing w:lineRule="auto" w:line="276"/>
+        <w:rPr/>
+      </w:pPr>
+      <w:r>
+        <w:rPr>
+          <w:b/>
+          <w:bCs/>
+        </w:rPr>
+        <w:t>Login Page</w:t>
+      </w:r>
+      <w:r>
+        <w:rPr/>
+        <w:t xml:space="preserve">: Page to login to the web application with user name and email address, </w:t>
+      </w:r>
+      <w:r>
+        <w:rPr/>
+        <w:t xml:space="preserve">also there shall be and option to create a </w:t>
+      </w:r>
+      <w:r>
+        <w:rPr>
+          <w:b/>
+          <w:bCs/>
+        </w:rPr>
+        <w:t>NEW</w:t>
+      </w:r>
+      <w:r>
+        <w:rPr>
+          <w:b/>
+          <w:bCs/>
+          <w:i w:val="false"/>
+          <w:iCs w:val="false"/>
+        </w:rPr>
+        <w:t xml:space="preserve"> USER</w:t>
+      </w:r>
+      <w:r>
+        <w:rPr/>
+        <w:t xml:space="preserve"> for further authentication with basic personal data such as full name and surname, and email address.</w:t>
+      </w:r>
+    </w:p>
+    <w:p>
+      <w:pPr>
+        <w:pStyle w:val="TextBody"/>
+        <w:numPr>
+          <w:ilvl w:val="0"/>
+          <w:numId w:val="26"/>
+        </w:numPr>
+        <w:bidi w:val="0"/>
+        <w:spacing w:lineRule="auto" w:line="276"/>
+        <w:rPr/>
+      </w:pPr>
+      <w:r>
+        <w:rPr>
+          <w:b/>
+          <w:bCs/>
+        </w:rPr>
+        <w:t>Search Page</w:t>
+      </w:r>
+      <w:r>
+        <w:rPr/>
+        <w:t xml:space="preserve">: Edit search terms in a search bar, </w:t>
+      </w:r>
+      <w:r>
+        <w:rPr/>
+        <w:t xml:space="preserve">optional </w:t>
+      </w:r>
+      <w:r>
+        <w:rPr/>
+        <w:t>if they are not already hard-coded.</w:t>
+      </w:r>
+    </w:p>
+    <w:p>
+      <w:pPr>
+        <w:pStyle w:val="TextBody"/>
+        <w:numPr>
+          <w:ilvl w:val="0"/>
+          <w:numId w:val="28"/>
+        </w:numPr>
+        <w:tabs>
+          <w:tab w:val="left" w:pos="709" w:leader="none"/>
+        </w:tabs>
+        <w:bidi w:val="0"/>
+        <w:ind w:start="709" w:hanging="283"/>
+        <w:rPr/>
+      </w:pPr>
+      <w:r>
+        <w:rPr>
+          <w:rStyle w:val="StrongEmphasis"/>
+        </w:rPr>
+        <w:t>Listing Page:</w:t>
+      </w:r>
+      <w:r>
+        <w:rPr/>
+        <w:t xml:space="preserve"> Visual representation of all news with breakdown feature in a table overview and Illustration of total summarization along with a detailed breakdown</w:t>
+      </w:r>
+    </w:p>
+    <w:p>
+      <w:pPr>
+        <w:pStyle w:val="TextBody"/>
+        <w:numPr>
+          <w:ilvl w:val="0"/>
+          <w:numId w:val="31"/>
+        </w:numPr>
+        <w:tabs>
+          <w:tab w:val="left" w:pos="709" w:leader="none"/>
+        </w:tabs>
+        <w:bidi w:val="0"/>
+        <w:ind w:start="709" w:hanging="283"/>
+        <w:rPr/>
+      </w:pPr>
+      <w:r>
+        <w:rPr>
+          <w:rStyle w:val="StrongEmphasis"/>
+        </w:rPr>
+        <w:t>Checkout Page:</w:t>
+      </w:r>
+      <w:r>
+        <w:rPr/>
+        <w:t xml:space="preserve"> Design ensuring consistency with previous pages </w:t>
+      </w:r>
+      <w:r>
+        <w:rPr/>
+        <w:t xml:space="preserve">when search session is over the user shall </w:t>
+      </w:r>
+      <w:r>
+        <w:rPr>
+          <w:b/>
+          <w:bCs/>
+        </w:rPr>
+        <w:t>LOGOUT</w:t>
+      </w:r>
+    </w:p>
+    <w:p>
+      <w:pPr>
+        <w:pStyle w:val="Heading4"/>
+        <w:bidi w:val="0"/>
+        <w:jc w:val="start"/>
+        <w:rPr/>
+      </w:pPr>
+      <w:bookmarkStart w:id="15" w:name="__RefHeading___Toc256_879683452"/>
+      <w:bookmarkEnd w:id="15"/>
+      <w:r>
+        <w:rPr/>
+        <w:t xml:space="preserve">6.2 </w:t>
+      </w:r>
+      <w:r>
+        <w:rPr>
+          <w:rStyle w:val="StrongEmphasis"/>
+        </w:rPr>
+        <w:t>User Flow</w:t>
       </w:r>
     </w:p>
     <w:p>
@@ -4969,162 +4648,7 @@
           <w:ilvl w:val="0"/>
           <w:numId w:val="27"/>
         </w:numPr>
-        <w:bidi w:val="0"/>
-        <w:spacing w:lineRule="auto" w:line="276"/>
-        <w:rPr/>
-      </w:pPr>
-      <w:r>
-        <w:rPr>
-          <w:b/>
-          <w:bCs/>
-        </w:rPr>
-        <w:t>Login Page</w:t>
-      </w:r>
-      <w:r>
-        <w:rPr/>
-        <w:t>: Page to login to the web application with user name and email address</w:t>
-      </w:r>
-    </w:p>
-    <w:p>
-      <w:pPr>
-        <w:pStyle w:val="TextBody"/>
-        <w:numPr>
-          <w:ilvl w:val="0"/>
-          <w:numId w:val="27"/>
-        </w:numPr>
-        <w:bidi w:val="0"/>
-        <w:spacing w:lineRule="auto" w:line="276"/>
-        <w:rPr/>
-      </w:pPr>
-      <w:r>
-        <w:rPr>
-          <w:b/>
-          <w:bCs/>
-        </w:rPr>
-        <w:t>Search Page</w:t>
-      </w:r>
-      <w:r>
-        <w:rPr/>
-        <w:t>: Edit search terms in a search bar, if they are not already hard-coded.</w:t>
-      </w:r>
-    </w:p>
-    <w:p>
-      <w:pPr>
-        <w:pStyle w:val="TextBody"/>
-        <w:numPr>
-          <w:ilvl w:val="0"/>
-          <w:numId w:val="30"/>
-        </w:numPr>
-        <w:tabs>
-          <w:tab w:val="clear" w:pos="709"/>
-          <w:tab w:val="left" w:pos="709" w:leader="none"/>
-        </w:tabs>
-        <w:bidi w:val="0"/>
-        <w:ind w:start="709" w:hanging="283"/>
-        <w:rPr/>
-      </w:pPr>
-      <w:r>
-        <w:rPr>
-          <w:rStyle w:val="StrongEmphasis"/>
-        </w:rPr>
-        <w:t>Listing Page:</w:t>
-      </w:r>
-      <w:r>
-        <w:rPr/>
-        <w:t xml:space="preserve"> Visual representation of </w:t>
-      </w:r>
-      <w:r>
-        <w:rPr/>
-        <w:t>all news</w:t>
-      </w:r>
-      <w:r>
-        <w:rPr/>
-        <w:t xml:space="preserve"> with breakdown feature </w:t>
-      </w:r>
-      <w:r>
-        <w:rPr/>
-        <w:t>in a table overview</w:t>
-      </w:r>
-      <w:r>
-        <w:rPr/>
-        <w:t xml:space="preserve"> </w:t>
-      </w:r>
-      <w:r>
-        <w:rPr/>
-        <w:t xml:space="preserve">and </w:t>
-      </w:r>
-      <w:r>
-        <w:rPr/>
-        <w:t xml:space="preserve">Illustration of total </w:t>
-      </w:r>
-      <w:r>
-        <w:rPr/>
-        <w:t>summarization</w:t>
-      </w:r>
-      <w:r>
-        <w:rPr/>
-        <w:t xml:space="preserve"> along with a detailed breakdown</w:t>
-      </w:r>
-    </w:p>
-    <w:p>
-      <w:pPr>
-        <w:pStyle w:val="TextBody"/>
-        <w:numPr>
-          <w:ilvl w:val="0"/>
-          <w:numId w:val="31"/>
-        </w:numPr>
-        <w:tabs>
-          <w:tab w:val="clear" w:pos="709"/>
-          <w:tab w:val="left" w:pos="709" w:leader="none"/>
-        </w:tabs>
-        <w:bidi w:val="0"/>
-        <w:ind w:start="709" w:hanging="283"/>
-        <w:rPr/>
-      </w:pPr>
-      <w:r>
-        <w:rPr>
-          <w:rStyle w:val="StrongEmphasis"/>
-        </w:rPr>
-        <w:t>Checkout Page:</w:t>
-      </w:r>
-      <w:r>
-        <w:rPr/>
-        <w:t xml:space="preserve"> Design ensuring consistency with previous pages</w:t>
-      </w:r>
-    </w:p>
-    <w:p>
-      <w:pPr>
-        <w:pStyle w:val="Heading4"/>
-        <w:bidi w:val="0"/>
-        <w:jc w:val="start"/>
-        <w:rPr/>
-      </w:pPr>
-      <w:bookmarkStart w:id="15" w:name="__RefHeading___Toc256_879683452"/>
-      <w:bookmarkEnd w:id="15"/>
-      <w:r>
-        <w:rPr/>
-        <w:t>6</w:t>
-      </w:r>
-      <w:r>
-        <w:rPr/>
-        <w:t xml:space="preserve">.2 </w:t>
-      </w:r>
-      <w:r>
-        <w:rPr>
-          <w:rStyle w:val="StrongEmphasis"/>
-        </w:rPr>
-        <w:t>User Flow</w:t>
-      </w:r>
-    </w:p>
-    <w:p>
-      <w:pPr>
-        <w:pStyle w:val="TextBody"/>
-        <w:numPr>
-          <w:ilvl w:val="0"/>
-          <w:numId w:val="29"/>
-        </w:numPr>
-        <w:tabs>
-          <w:tab w:val="clear" w:pos="709"/>
+        <w:tabs>
           <w:tab w:val="left" w:pos="709" w:leader="none"/>
         </w:tabs>
         <w:bidi w:val="0"/>
@@ -5168,13 +4692,7 @@
         <w:rPr>
           <w:rStyle w:val="StrongEmphasis"/>
         </w:rPr>
-        <w:t>7</w:t>
-      </w:r>
-      <w:r>
-        <w:rPr>
-          <w:rStyle w:val="StrongEmphasis"/>
-        </w:rPr>
-        <w:t>. User Stories</w:t>
+        <w:t>7. User Stories</w:t>
       </w:r>
     </w:p>
     <w:p>
@@ -5231,15 +4749,7 @@
       </w:r>
       <w:r>
         <w:rPr/>
-        <w:t xml:space="preserve">: </w:t>
-      </w:r>
-      <w:r>
-        <w:rPr/>
-        <w:t xml:space="preserve"> </w:t>
-      </w:r>
-      <w:r>
-        <w:rPr/>
-        <w:t>As a crisis communications lead, I want to manually trigger the agent when breaking news occurs to get immediate comprehensive coverage.</w:t>
+        <w:t>:  As a crisis communications lead, I want to manually trigger the agent when breaking news occurs to get immediate comprehensive coverage.</w:t>
       </w:r>
     </w:p>
     <w:p>
@@ -5290,13 +4800,7 @@
         <w:rPr>
           <w:rStyle w:val="StrongEmphasis"/>
         </w:rPr>
-        <w:t>8</w:t>
-      </w:r>
-      <w:r>
-        <w:rPr>
-          <w:rStyle w:val="StrongEmphasis"/>
-        </w:rPr>
-        <w:t>. Non-Functional Requirements</w:t>
+        <w:t>8. Non-Functional Requirements</w:t>
       </w:r>
     </w:p>
     <w:p>
@@ -5322,7 +4826,6 @@
           <w:numId w:val="14"/>
         </w:numPr>
         <w:tabs>
-          <w:tab w:val="clear" w:pos="709"/>
           <w:tab w:val="left" w:pos="709" w:leader="none"/>
         </w:tabs>
         <w:bidi w:val="0"/>
@@ -5343,7 +4846,6 @@
           <w:numId w:val="14"/>
         </w:numPr>
         <w:tabs>
-          <w:tab w:val="clear" w:pos="709"/>
           <w:tab w:val="left" w:pos="709" w:leader="none"/>
         </w:tabs>
         <w:bidi w:val="0"/>
@@ -5364,7 +4866,6 @@
           <w:numId w:val="14"/>
         </w:numPr>
         <w:tabs>
-          <w:tab w:val="clear" w:pos="709"/>
           <w:tab w:val="left" w:pos="709" w:leader="none"/>
         </w:tabs>
         <w:bidi w:val="0"/>
@@ -5397,7 +4898,6 @@
           <w:numId w:val="15"/>
         </w:numPr>
         <w:tabs>
-          <w:tab w:val="clear" w:pos="709"/>
           <w:tab w:val="left" w:pos="709" w:leader="none"/>
         </w:tabs>
         <w:bidi w:val="0"/>
@@ -5418,7 +4918,6 @@
           <w:numId w:val="15"/>
         </w:numPr>
         <w:tabs>
-          <w:tab w:val="clear" w:pos="709"/>
           <w:tab w:val="left" w:pos="709" w:leader="none"/>
         </w:tabs>
         <w:bidi w:val="0"/>
@@ -5439,7 +4938,6 @@
           <w:numId w:val="15"/>
         </w:numPr>
         <w:tabs>
-          <w:tab w:val="clear" w:pos="709"/>
           <w:tab w:val="left" w:pos="709" w:leader="none"/>
         </w:tabs>
         <w:bidi w:val="0"/>
@@ -5472,7 +4970,6 @@
           <w:numId w:val="16"/>
         </w:numPr>
         <w:tabs>
-          <w:tab w:val="clear" w:pos="709"/>
           <w:tab w:val="left" w:pos="709" w:leader="none"/>
         </w:tabs>
         <w:bidi w:val="0"/>
@@ -5493,7 +4990,6 @@
           <w:numId w:val="16"/>
         </w:numPr>
         <w:tabs>
-          <w:tab w:val="clear" w:pos="709"/>
           <w:tab w:val="left" w:pos="709" w:leader="none"/>
         </w:tabs>
         <w:bidi w:val="0"/>
@@ -5514,7 +5010,6 @@
           <w:numId w:val="16"/>
         </w:numPr>
         <w:tabs>
-          <w:tab w:val="clear" w:pos="709"/>
           <w:tab w:val="left" w:pos="709" w:leader="none"/>
         </w:tabs>
         <w:bidi w:val="0"/>
@@ -5547,7 +5042,6 @@
           <w:numId w:val="17"/>
         </w:numPr>
         <w:tabs>
-          <w:tab w:val="clear" w:pos="709"/>
           <w:tab w:val="left" w:pos="709" w:leader="none"/>
         </w:tabs>
         <w:bidi w:val="0"/>
@@ -5580,7 +5074,6 @@
           <w:numId w:val="17"/>
         </w:numPr>
         <w:tabs>
-          <w:tab w:val="clear" w:pos="709"/>
           <w:tab w:val="left" w:pos="709" w:leader="none"/>
         </w:tabs>
         <w:bidi w:val="0"/>
@@ -5613,7 +5106,6 @@
           <w:numId w:val="17"/>
         </w:numPr>
         <w:tabs>
-          <w:tab w:val="clear" w:pos="709"/>
           <w:tab w:val="left" w:pos="709" w:leader="none"/>
         </w:tabs>
         <w:bidi w:val="0"/>
@@ -5646,7 +5138,6 @@
           <w:numId w:val="18"/>
         </w:numPr>
         <w:tabs>
-          <w:tab w:val="clear" w:pos="709"/>
           <w:tab w:val="left" w:pos="709" w:leader="none"/>
         </w:tabs>
         <w:bidi w:val="0"/>
@@ -5667,7 +5158,6 @@
           <w:numId w:val="18"/>
         </w:numPr>
         <w:tabs>
-          <w:tab w:val="clear" w:pos="709"/>
           <w:tab w:val="left" w:pos="709" w:leader="none"/>
         </w:tabs>
         <w:bidi w:val="0"/>
@@ -5688,7 +5178,6 @@
           <w:numId w:val="18"/>
         </w:numPr>
         <w:tabs>
-          <w:tab w:val="clear" w:pos="709"/>
           <w:tab w:val="left" w:pos="709" w:leader="none"/>
         </w:tabs>
         <w:bidi w:val="0"/>
@@ -5724,13 +5213,7 @@
         <w:rPr>
           <w:rStyle w:val="StrongEmphasis"/>
         </w:rPr>
-        <w:t>9</w:t>
-      </w:r>
-      <w:r>
-        <w:rPr>
-          <w:rStyle w:val="StrongEmphasis"/>
-        </w:rPr>
-        <w:t>. Implementation Phases</w:t>
+        <w:t>9. Implementation Phases</w:t>
       </w:r>
     </w:p>
     <w:p>
@@ -5757,7 +5240,6 @@
           <w:numId w:val="19"/>
         </w:numPr>
         <w:tabs>
-          <w:tab w:val="clear" w:pos="709"/>
           <w:tab w:val="left" w:pos="709" w:leader="none"/>
         </w:tabs>
         <w:bidi w:val="0"/>
@@ -5778,7 +5260,6 @@
           <w:numId w:val="19"/>
         </w:numPr>
         <w:tabs>
-          <w:tab w:val="clear" w:pos="709"/>
           <w:tab w:val="left" w:pos="709" w:leader="none"/>
         </w:tabs>
         <w:bidi w:val="0"/>
@@ -5799,7 +5280,6 @@
           <w:numId w:val="19"/>
         </w:numPr>
         <w:tabs>
-          <w:tab w:val="clear" w:pos="709"/>
           <w:tab w:val="left" w:pos="709" w:leader="none"/>
         </w:tabs>
         <w:bidi w:val="0"/>
@@ -5832,7 +5312,6 @@
           <w:numId w:val="19"/>
         </w:numPr>
         <w:tabs>
-          <w:tab w:val="clear" w:pos="709"/>
           <w:tab w:val="left" w:pos="709" w:leader="none"/>
         </w:tabs>
         <w:bidi w:val="0"/>
@@ -5851,13 +5330,25 @@
         <w:jc w:val="start"/>
         <w:rPr/>
       </w:pPr>
-      <w:bookmarkStart w:id="20" w:name="__RefHeading___Toc266_879683452"/>
+      <w:bookmarkStart w:id="20" w:name="__RefHeading___Toc268_879683452"/>
       <w:bookmarkEnd w:id="20"/>
       <w:r>
         <w:rPr>
           <w:rStyle w:val="StrongEmphasis"/>
         </w:rPr>
-        <w:t>Phase 2: Social Media Integration (Weeks 3-4)</w:t>
+        <w:t xml:space="preserve">Phase 3: Report Generation (Week </w:t>
+      </w:r>
+      <w:r>
+        <w:rPr>
+          <w:rStyle w:val="StrongEmphasis"/>
+        </w:rPr>
+        <w:t>3-4</w:t>
+      </w:r>
+      <w:r>
+        <w:rPr>
+          <w:rStyle w:val="StrongEmphasis"/>
+        </w:rPr>
+        <w:t>)</w:t>
       </w:r>
     </w:p>
     <w:p>
@@ -5868,7 +5359,6 @@
           <w:numId w:val="20"/>
         </w:numPr>
         <w:tabs>
-          <w:tab w:val="clear" w:pos="709"/>
           <w:tab w:val="left" w:pos="709" w:leader="none"/>
         </w:tabs>
         <w:bidi w:val="0"/>
@@ -5878,18 +5368,7 @@
       </w:pPr>
       <w:r>
         <w:rPr/>
-        <w:t xml:space="preserve">Integrate social media </w:t>
-      </w:r>
-      <w:r>
-        <w:rPr>
-          <w:b/>
-          <w:bCs/>
-        </w:rPr>
-        <w:t>APIs</w:t>
-      </w:r>
-      <w:r>
-        <w:rPr/>
-        <w:t xml:space="preserve"> </w:t>
+        <w:t xml:space="preserve">Build Markdown report generator </w:t>
       </w:r>
     </w:p>
     <w:p>
@@ -5900,7 +5379,6 @@
           <w:numId w:val="20"/>
         </w:numPr>
         <w:tabs>
-          <w:tab w:val="clear" w:pos="709"/>
           <w:tab w:val="left" w:pos="709" w:leader="none"/>
         </w:tabs>
         <w:bidi w:val="0"/>
@@ -5910,7 +5388,7 @@
       </w:pPr>
       <w:r>
         <w:rPr/>
-        <w:t xml:space="preserve">Implement authentication and rate limiting </w:t>
+        <w:t xml:space="preserve">Implement email delivery system </w:t>
       </w:r>
     </w:p>
     <w:p>
@@ -5921,7 +5399,6 @@
           <w:numId w:val="20"/>
         </w:numPr>
         <w:tabs>
-          <w:tab w:val="clear" w:pos="709"/>
           <w:tab w:val="left" w:pos="709" w:leader="none"/>
         </w:tabs>
         <w:bidi w:val="0"/>
@@ -5930,7 +5407,7 @@
       </w:pPr>
       <w:r>
         <w:rPr/>
-        <w:t xml:space="preserve">Test data extraction across platforms </w:t>
+        <w:t xml:space="preserve">Create report templates </w:t>
       </w:r>
     </w:p>
     <w:p>
@@ -5940,13 +5417,25 @@
         <w:jc w:val="start"/>
         <w:rPr/>
       </w:pPr>
-      <w:bookmarkStart w:id="21" w:name="__RefHeading___Toc268_879683452"/>
+      <w:bookmarkStart w:id="21" w:name="__RefHeading___Toc270_879683452"/>
       <w:bookmarkEnd w:id="21"/>
       <w:r>
         <w:rPr>
           <w:rStyle w:val="StrongEmphasis"/>
         </w:rPr>
-        <w:t>Phase 3: Report Generation (Week 5)</w:t>
+        <w:t xml:space="preserve">Phase 4: Scheduling &amp; Automation (Week </w:t>
+      </w:r>
+      <w:r>
+        <w:rPr>
+          <w:rStyle w:val="StrongEmphasis"/>
+        </w:rPr>
+        <w:t>5</w:t>
+      </w:r>
+      <w:r>
+        <w:rPr>
+          <w:rStyle w:val="StrongEmphasis"/>
+        </w:rPr>
+        <w:t>)</w:t>
       </w:r>
     </w:p>
     <w:p>
@@ -5957,7 +5446,6 @@
           <w:numId w:val="21"/>
         </w:numPr>
         <w:tabs>
-          <w:tab w:val="clear" w:pos="709"/>
           <w:tab w:val="left" w:pos="709" w:leader="none"/>
         </w:tabs>
         <w:bidi w:val="0"/>
@@ -5967,7 +5455,7 @@
       </w:pPr>
       <w:r>
         <w:rPr/>
-        <w:t xml:space="preserve">Build Markdown report generator </w:t>
+        <w:t xml:space="preserve">Implement cron/scheduler for 06:00 AM execution </w:t>
       </w:r>
     </w:p>
     <w:p>
@@ -5978,7 +5466,6 @@
           <w:numId w:val="21"/>
         </w:numPr>
         <w:tabs>
-          <w:tab w:val="clear" w:pos="709"/>
           <w:tab w:val="left" w:pos="709" w:leader="none"/>
         </w:tabs>
         <w:bidi w:val="0"/>
@@ -5988,7 +5475,7 @@
       </w:pPr>
       <w:r>
         <w:rPr/>
-        <w:t xml:space="preserve">Implement email delivery system </w:t>
+        <w:t xml:space="preserve">Add manual trigger mechanism </w:t>
       </w:r>
     </w:p>
     <w:p>
@@ -5999,7 +5486,6 @@
           <w:numId w:val="21"/>
         </w:numPr>
         <w:tabs>
-          <w:tab w:val="clear" w:pos="709"/>
           <w:tab w:val="left" w:pos="709" w:leader="none"/>
         </w:tabs>
         <w:bidi w:val="0"/>
@@ -6008,7 +5494,7 @@
       </w:pPr>
       <w:r>
         <w:rPr/>
-        <w:t xml:space="preserve">Create report templates </w:t>
+        <w:t xml:space="preserve">Set up monitoring and alerts </w:t>
       </w:r>
     </w:p>
     <w:p>
@@ -6018,13 +5504,25 @@
         <w:jc w:val="start"/>
         <w:rPr/>
       </w:pPr>
-      <w:bookmarkStart w:id="22" w:name="__RefHeading___Toc270_879683452"/>
+      <w:bookmarkStart w:id="22" w:name="__RefHeading___Toc272_879683452"/>
       <w:bookmarkEnd w:id="22"/>
       <w:r>
         <w:rPr>
           <w:rStyle w:val="StrongEmphasis"/>
         </w:rPr>
-        <w:t>Phase 4: Scheduling &amp; Automation (Week 6)</w:t>
+        <w:t xml:space="preserve">Phase 5: Testing &amp; Refinement (Weeks </w:t>
+      </w:r>
+      <w:r>
+        <w:rPr>
+          <w:rStyle w:val="StrongEmphasis"/>
+        </w:rPr>
+        <w:t>6-7</w:t>
+      </w:r>
+      <w:r>
+        <w:rPr>
+          <w:rStyle w:val="StrongEmphasis"/>
+        </w:rPr>
+        <w:t>)</w:t>
       </w:r>
     </w:p>
     <w:p>
@@ -6035,7 +5533,6 @@
           <w:numId w:val="22"/>
         </w:numPr>
         <w:tabs>
-          <w:tab w:val="clear" w:pos="709"/>
           <w:tab w:val="left" w:pos="709" w:leader="none"/>
         </w:tabs>
         <w:bidi w:val="0"/>
@@ -6045,7 +5542,7 @@
       </w:pPr>
       <w:r>
         <w:rPr/>
-        <w:t xml:space="preserve">Implement cron/scheduler for 06:00 AM execution </w:t>
+        <w:t xml:space="preserve">End-to-end testing </w:t>
       </w:r>
     </w:p>
     <w:p>
@@ -6056,7 +5553,6 @@
           <w:numId w:val="22"/>
         </w:numPr>
         <w:tabs>
-          <w:tab w:val="clear" w:pos="709"/>
           <w:tab w:val="left" w:pos="709" w:leader="none"/>
         </w:tabs>
         <w:bidi w:val="0"/>
@@ -6066,7 +5562,7 @@
       </w:pPr>
       <w:r>
         <w:rPr/>
-        <w:t xml:space="preserve">Add manual trigger mechanism </w:t>
+        <w:t xml:space="preserve">Performance optimization </w:t>
       </w:r>
     </w:p>
     <w:p>
@@ -6077,7 +5573,6 @@
           <w:numId w:val="22"/>
         </w:numPr>
         <w:tabs>
-          <w:tab w:val="clear" w:pos="709"/>
           <w:tab w:val="left" w:pos="709" w:leader="none"/>
         </w:tabs>
         <w:bidi w:val="0"/>
@@ -6086,23 +5581,34 @@
       </w:pPr>
       <w:r>
         <w:rPr/>
-        <w:t xml:space="preserve">Set up monitoring and alerts </w:t>
-      </w:r>
-    </w:p>
-    <w:p>
-      <w:pPr>
-        <w:pStyle w:val="Heading4"/>
-        <w:bidi w:val="0"/>
-        <w:jc w:val="start"/>
-        <w:rPr/>
-      </w:pPr>
-      <w:bookmarkStart w:id="23" w:name="__RefHeading___Toc272_879683452"/>
+        <w:t xml:space="preserve">Bug fixes and refinements </w:t>
+      </w:r>
+    </w:p>
+    <w:p>
+      <w:pPr>
+        <w:pStyle w:val="HorizontalLine"/>
+        <w:bidi w:val="0"/>
+        <w:jc w:val="start"/>
+        <w:rPr/>
+      </w:pPr>
+      <w:r>
+        <w:rPr/>
+      </w:r>
+    </w:p>
+    <w:p>
+      <w:pPr>
+        <w:pStyle w:val="Heading3"/>
+        <w:bidi w:val="0"/>
+        <w:jc w:val="start"/>
+        <w:rPr/>
+      </w:pPr>
+      <w:bookmarkStart w:id="23" w:name="__RefHeading___Toc274_879683452"/>
       <w:bookmarkEnd w:id="23"/>
       <w:r>
         <w:rPr>
           <w:rStyle w:val="StrongEmphasis"/>
         </w:rPr>
-        <w:t>Phase 5: Testing &amp; Refinement (Weeks 7-8)</w:t>
+        <w:t>10. Success Metrics</w:t>
       </w:r>
     </w:p>
     <w:p>
@@ -6113,7 +5619,6 @@
           <w:numId w:val="23"/>
         </w:numPr>
         <w:tabs>
-          <w:tab w:val="clear" w:pos="709"/>
           <w:tab w:val="left" w:pos="709" w:leader="none"/>
         </w:tabs>
         <w:bidi w:val="0"/>
@@ -6122,8 +5627,14 @@
         <w:rPr/>
       </w:pPr>
       <w:r>
-        <w:rPr/>
-        <w:t xml:space="preserve">End-to-end testing </w:t>
+        <w:rPr>
+          <w:rStyle w:val="StrongEmphasis"/>
+        </w:rPr>
+        <w:t>Execution Success Rate</w:t>
+      </w:r>
+      <w:r>
+        <w:rPr/>
+        <w:t xml:space="preserve">: &gt;99% of scheduled runs complete successfully </w:t>
       </w:r>
     </w:p>
     <w:p>
@@ -6134,7 +5645,6 @@
           <w:numId w:val="23"/>
         </w:numPr>
         <w:tabs>
-          <w:tab w:val="clear" w:pos="709"/>
           <w:tab w:val="left" w:pos="709" w:leader="none"/>
         </w:tabs>
         <w:bidi w:val="0"/>
@@ -6143,8 +5653,14 @@
         <w:rPr/>
       </w:pPr>
       <w:r>
-        <w:rPr/>
-        <w:t xml:space="preserve">Performance optimization </w:t>
+        <w:rPr>
+          <w:rStyle w:val="StrongEmphasis"/>
+        </w:rPr>
+        <w:t>Coverage Completeness</w:t>
+      </w:r>
+      <w:r>
+        <w:rPr/>
+        <w:t xml:space="preserve">: &gt;95% of configured sources scanned per run </w:t>
       </w:r>
     </w:p>
     <w:p>
@@ -6155,49 +5671,22 @@
           <w:numId w:val="23"/>
         </w:numPr>
         <w:tabs>
-          <w:tab w:val="clear" w:pos="709"/>
           <w:tab w:val="left" w:pos="709" w:leader="none"/>
         </w:tabs>
         <w:bidi w:val="0"/>
+        <w:spacing w:before="0" w:after="0"/>
         <w:ind w:start="709" w:hanging="283"/>
         <w:rPr/>
       </w:pPr>
       <w:r>
-        <w:rPr/>
-        <w:t xml:space="preserve">Bug fixes and refinements </w:t>
-      </w:r>
-    </w:p>
-    <w:p>
-      <w:pPr>
-        <w:pStyle w:val="HorizontalLine"/>
-        <w:bidi w:val="0"/>
-        <w:jc w:val="start"/>
-        <w:rPr/>
-      </w:pPr>
-      <w:r>
-        <w:rPr/>
-      </w:r>
-    </w:p>
-    <w:p>
-      <w:pPr>
-        <w:pStyle w:val="Heading3"/>
-        <w:bidi w:val="0"/>
-        <w:jc w:val="start"/>
-        <w:rPr/>
-      </w:pPr>
-      <w:bookmarkStart w:id="24" w:name="__RefHeading___Toc274_879683452"/>
-      <w:bookmarkEnd w:id="24"/>
-      <w:r>
         <w:rPr>
           <w:rStyle w:val="StrongEmphasis"/>
         </w:rPr>
-        <w:t>10</w:t>
-      </w:r>
-      <w:r>
-        <w:rPr>
-          <w:rStyle w:val="StrongEmphasis"/>
-        </w:rPr>
-        <w:t>. Success Metrics</w:t>
+        <w:t>Delivery Time</w:t>
+      </w:r>
+      <w:r>
+        <w:rPr/>
+        <w:t xml:space="preserve">: Reports delivered within 5 minutes of completion </w:t>
       </w:r>
     </w:p>
     <w:p>
@@ -6205,10 +5694,9 @@
         <w:pStyle w:val="TextBody"/>
         <w:numPr>
           <w:ilvl w:val="0"/>
-          <w:numId w:val="24"/>
+          <w:numId w:val="23"/>
         </w:numPr>
         <w:tabs>
-          <w:tab w:val="clear" w:pos="709"/>
           <w:tab w:val="left" w:pos="709" w:leader="none"/>
         </w:tabs>
         <w:bidi w:val="0"/>
@@ -6220,11 +5708,11 @@
         <w:rPr>
           <w:rStyle w:val="StrongEmphasis"/>
         </w:rPr>
-        <w:t>Execution Success Rate</w:t>
-      </w:r>
-      <w:r>
-        <w:rPr/>
-        <w:t xml:space="preserve">: &gt;99% of scheduled runs complete successfully </w:t>
+        <w:t>False Positive Rate</w:t>
+      </w:r>
+      <w:r>
+        <w:rPr/>
+        <w:t xml:space="preserve">: &lt;10% irrelevant results included </w:t>
       </w:r>
     </w:p>
     <w:p>
@@ -6232,14 +5720,12 @@
         <w:pStyle w:val="TextBody"/>
         <w:numPr>
           <w:ilvl w:val="0"/>
-          <w:numId w:val="24"/>
+          <w:numId w:val="23"/>
         </w:numPr>
         <w:tabs>
-          <w:tab w:val="clear" w:pos="709"/>
           <w:tab w:val="left" w:pos="709" w:leader="none"/>
         </w:tabs>
         <w:bidi w:val="0"/>
-        <w:spacing w:before="0" w:after="0"/>
         <w:ind w:start="709" w:hanging="283"/>
         <w:rPr/>
       </w:pPr>
@@ -6247,130 +5733,38 @@
         <w:rPr>
           <w:rStyle w:val="StrongEmphasis"/>
         </w:rPr>
-        <w:t>Coverage Completeness</w:t>
-      </w:r>
-      <w:r>
-        <w:rPr/>
-        <w:t xml:space="preserve">: &gt;95% of configured sources scanned per run </w:t>
-      </w:r>
-    </w:p>
-    <w:p>
-      <w:pPr>
-        <w:pStyle w:val="TextBody"/>
-        <w:numPr>
-          <w:ilvl w:val="0"/>
-          <w:numId w:val="24"/>
-        </w:numPr>
-        <w:tabs>
-          <w:tab w:val="clear" w:pos="709"/>
-          <w:tab w:val="left" w:pos="709" w:leader="none"/>
-        </w:tabs>
-        <w:bidi w:val="0"/>
-        <w:spacing w:before="0" w:after="0"/>
-        <w:ind w:start="709" w:hanging="283"/>
-        <w:rPr/>
-      </w:pPr>
+        <w:t>User Satisfaction</w:t>
+      </w:r>
+      <w:r>
+        <w:rPr/>
+        <w:t xml:space="preserve">: &gt;4.5/5 rating on report usefulness </w:t>
+      </w:r>
+    </w:p>
+    <w:p>
+      <w:pPr>
+        <w:pStyle w:val="HorizontalLine"/>
+        <w:bidi w:val="0"/>
+        <w:jc w:val="start"/>
+        <w:rPr/>
+      </w:pPr>
+      <w:r>
+        <w:rPr/>
+      </w:r>
+    </w:p>
+    <w:p>
+      <w:pPr>
+        <w:pStyle w:val="Heading3"/>
+        <w:bidi w:val="0"/>
+        <w:jc w:val="start"/>
+        <w:rPr/>
+      </w:pPr>
+      <w:bookmarkStart w:id="24" w:name="__RefHeading___Toc276_879683452"/>
+      <w:bookmarkEnd w:id="24"/>
       <w:r>
         <w:rPr>
           <w:rStyle w:val="StrongEmphasis"/>
         </w:rPr>
-        <w:t>Delivery Time</w:t>
-      </w:r>
-      <w:r>
-        <w:rPr/>
-        <w:t xml:space="preserve">: Reports delivered within 5 minutes of completion </w:t>
-      </w:r>
-    </w:p>
-    <w:p>
-      <w:pPr>
-        <w:pStyle w:val="TextBody"/>
-        <w:numPr>
-          <w:ilvl w:val="0"/>
-          <w:numId w:val="24"/>
-        </w:numPr>
-        <w:tabs>
-          <w:tab w:val="clear" w:pos="709"/>
-          <w:tab w:val="left" w:pos="709" w:leader="none"/>
-        </w:tabs>
-        <w:bidi w:val="0"/>
-        <w:spacing w:before="0" w:after="0"/>
-        <w:ind w:start="709" w:hanging="283"/>
-        <w:rPr/>
-      </w:pPr>
-      <w:r>
-        <w:rPr>
-          <w:rStyle w:val="StrongEmphasis"/>
-        </w:rPr>
-        <w:t>False Positive Rate</w:t>
-      </w:r>
-      <w:r>
-        <w:rPr/>
-        <w:t xml:space="preserve">: &lt;10% irrelevant results included </w:t>
-      </w:r>
-    </w:p>
-    <w:p>
-      <w:pPr>
-        <w:pStyle w:val="TextBody"/>
-        <w:numPr>
-          <w:ilvl w:val="0"/>
-          <w:numId w:val="24"/>
-        </w:numPr>
-        <w:tabs>
-          <w:tab w:val="clear" w:pos="709"/>
-          <w:tab w:val="left" w:pos="709" w:leader="none"/>
-        </w:tabs>
-        <w:bidi w:val="0"/>
-        <w:ind w:start="709" w:hanging="283"/>
-        <w:rPr/>
-      </w:pPr>
-      <w:r>
-        <w:rPr>
-          <w:rStyle w:val="StrongEmphasis"/>
-        </w:rPr>
-        <w:t>User Satisfaction</w:t>
-      </w:r>
-      <w:r>
-        <w:rPr/>
-        <w:t xml:space="preserve">: &gt;4.5/5 rating on report usefulness </w:t>
-      </w:r>
-    </w:p>
-    <w:p>
-      <w:pPr>
-        <w:pStyle w:val="HorizontalLine"/>
-        <w:bidi w:val="0"/>
-        <w:jc w:val="start"/>
-        <w:rPr/>
-      </w:pPr>
-      <w:r>
-        <w:rPr/>
-      </w:r>
-    </w:p>
-    <w:p>
-      <w:pPr>
-        <w:pStyle w:val="Heading3"/>
-        <w:bidi w:val="0"/>
-        <w:jc w:val="start"/>
-        <w:rPr/>
-      </w:pPr>
-      <w:bookmarkStart w:id="25" w:name="__RefHeading___Toc276_879683452"/>
-      <w:bookmarkEnd w:id="25"/>
-      <w:r>
-        <w:rPr>
-          <w:rStyle w:val="StrongEmphasis"/>
-        </w:rPr>
-        <w:t>1</w:t>
-      </w:r>
-      <w:r>
-        <w:rPr>
-          <w:rStyle w:val="StrongEmphasis"/>
-        </w:rPr>
-        <w:t>1</w:t>
-      </w:r>
-      <w:r>
-        <w:rPr>
-          <w:rStyle w:val="StrongEmphasis"/>
-        </w:rPr>
-        <w:t>. Risks &amp; Mitigation</w:t>
+        <w:t>11. Risks &amp; Mitigation</w:t>
       </w:r>
     </w:p>
     <w:tbl>
@@ -6387,10 +5781,10 @@
         </w:tblCellMar>
       </w:tblPr>
       <w:tblGrid>
-        <w:gridCol w:w="2558"/>
+        <w:gridCol w:w="2557"/>
         <w:gridCol w:w="914"/>
-        <w:gridCol w:w="1259"/>
-        <w:gridCol w:w="4907"/>
+        <w:gridCol w:w="1260"/>
+        <w:gridCol w:w="4906"/>
       </w:tblGrid>
       <w:tr>
         <w:trPr>
@@ -6398,13 +5792,14 @@
         </w:trPr>
         <w:tc>
           <w:tcPr>
-            <w:tcW w:w="2558" w:type="dxa"/>
+            <w:tcW w:w="2557" w:type="dxa"/>
             <w:tcBorders/>
             <w:vAlign w:val="center"/>
           </w:tcPr>
           <w:p>
             <w:pPr>
               <w:pStyle w:val="TableHeading"/>
+              <w:widowControl w:val="false"/>
               <w:suppressLineNumbers/>
               <w:bidi w:val="0"/>
               <w:jc w:val="center"/>
@@ -6425,6 +5820,7 @@
           <w:p>
             <w:pPr>
               <w:pStyle w:val="TableHeading"/>
+              <w:widowControl w:val="false"/>
               <w:suppressLineNumbers/>
               <w:bidi w:val="0"/>
               <w:jc w:val="center"/>
@@ -6438,13 +5834,14 @@
         </w:tc>
         <w:tc>
           <w:tcPr>
-            <w:tcW w:w="1259" w:type="dxa"/>
+            <w:tcW w:w="1260" w:type="dxa"/>
             <w:tcBorders/>
             <w:vAlign w:val="center"/>
           </w:tcPr>
           <w:p>
             <w:pPr>
               <w:pStyle w:val="TableHeading"/>
+              <w:widowControl w:val="false"/>
               <w:suppressLineNumbers/>
               <w:bidi w:val="0"/>
               <w:jc w:val="center"/>
@@ -6458,13 +5855,14 @@
         </w:tc>
         <w:tc>
           <w:tcPr>
-            <w:tcW w:w="4907" w:type="dxa"/>
+            <w:tcW w:w="4906" w:type="dxa"/>
             <w:tcBorders/>
             <w:vAlign w:val="center"/>
           </w:tcPr>
           <w:p>
             <w:pPr>
               <w:pStyle w:val="TableHeading"/>
+              <w:widowControl w:val="false"/>
               <w:suppressLineNumbers/>
               <w:bidi w:val="0"/>
               <w:jc w:val="center"/>
@@ -6481,94 +5879,7 @@
         <w:trPr/>
         <w:tc>
           <w:tcPr>
-            <w:tcW w:w="2558" w:type="dxa"/>
-            <w:tcBorders/>
-            <w:vAlign w:val="center"/>
-          </w:tcPr>
-          <w:p>
-            <w:pPr>
-              <w:pStyle w:val="TableContents"/>
-              <w:widowControl w:val="false"/>
-              <w:suppressLineNumbers/>
-              <w:bidi w:val="0"/>
-              <w:jc w:val="start"/>
-              <w:rPr/>
-            </w:pPr>
-            <w:r>
-              <w:rPr/>
-              <w:t>Social media API changes</w:t>
-            </w:r>
-          </w:p>
-        </w:tc>
-        <w:tc>
-          <w:tcPr>
-            <w:tcW w:w="914" w:type="dxa"/>
-            <w:tcBorders/>
-            <w:vAlign w:val="center"/>
-          </w:tcPr>
-          <w:p>
-            <w:pPr>
-              <w:pStyle w:val="TableContents"/>
-              <w:widowControl w:val="false"/>
-              <w:suppressLineNumbers/>
-              <w:bidi w:val="0"/>
-              <w:jc w:val="start"/>
-              <w:rPr/>
-            </w:pPr>
-            <w:r>
-              <w:rPr/>
-              <w:t>High</w:t>
-            </w:r>
-          </w:p>
-        </w:tc>
-        <w:tc>
-          <w:tcPr>
-            <w:tcW w:w="1259" w:type="dxa"/>
-            <w:tcBorders/>
-            <w:vAlign w:val="center"/>
-          </w:tcPr>
-          <w:p>
-            <w:pPr>
-              <w:pStyle w:val="TableContents"/>
-              <w:widowControl w:val="false"/>
-              <w:suppressLineNumbers/>
-              <w:bidi w:val="0"/>
-              <w:jc w:val="start"/>
-              <w:rPr/>
-            </w:pPr>
-            <w:r>
-              <w:rPr/>
-              <w:t>Medium</w:t>
-            </w:r>
-          </w:p>
-        </w:tc>
-        <w:tc>
-          <w:tcPr>
-            <w:tcW w:w="4907" w:type="dxa"/>
-            <w:tcBorders/>
-            <w:vAlign w:val="center"/>
-          </w:tcPr>
-          <w:p>
-            <w:pPr>
-              <w:pStyle w:val="TableContents"/>
-              <w:widowControl w:val="false"/>
-              <w:suppressLineNumbers/>
-              <w:bidi w:val="0"/>
-              <w:jc w:val="start"/>
-              <w:rPr/>
-            </w:pPr>
-            <w:r>
-              <w:rPr/>
-              <w:t>Maintain multiple data sources, implement adapter pattern</w:t>
-            </w:r>
-          </w:p>
-        </w:tc>
-      </w:tr>
-      <w:tr>
-        <w:trPr/>
-        <w:tc>
-          <w:tcPr>
-            <w:tcW w:w="2558" w:type="dxa"/>
+            <w:tcW w:w="2557" w:type="dxa"/>
             <w:tcBorders/>
             <w:vAlign w:val="center"/>
           </w:tcPr>
@@ -6610,7 +5921,7 @@
         </w:tc>
         <w:tc>
           <w:tcPr>
-            <w:tcW w:w="1259" w:type="dxa"/>
+            <w:tcW w:w="1260" w:type="dxa"/>
             <w:tcBorders/>
             <w:vAlign w:val="center"/>
           </w:tcPr>
@@ -6631,7 +5942,7 @@
         </w:tc>
         <w:tc>
           <w:tcPr>
-            <w:tcW w:w="4907" w:type="dxa"/>
+            <w:tcW w:w="4906" w:type="dxa"/>
             <w:tcBorders/>
             <w:vAlign w:val="center"/>
           </w:tcPr>
@@ -6655,7 +5966,7 @@
         <w:trPr/>
         <w:tc>
           <w:tcPr>
-            <w:tcW w:w="2558" w:type="dxa"/>
+            <w:tcW w:w="2557" w:type="dxa"/>
             <w:tcBorders/>
             <w:vAlign w:val="center"/>
           </w:tcPr>
@@ -6697,7 +6008,7 @@
         </w:tc>
         <w:tc>
           <w:tcPr>
-            <w:tcW w:w="1259" w:type="dxa"/>
+            <w:tcW w:w="1260" w:type="dxa"/>
             <w:tcBorders/>
             <w:vAlign w:val="center"/>
           </w:tcPr>
@@ -6718,7 +6029,7 @@
         </w:tc>
         <w:tc>
           <w:tcPr>
-            <w:tcW w:w="4907" w:type="dxa"/>
+            <w:tcW w:w="4906" w:type="dxa"/>
             <w:tcBorders/>
             <w:vAlign w:val="center"/>
           </w:tcPr>
@@ -6742,7 +6053,7 @@
         <w:trPr/>
         <w:tc>
           <w:tcPr>
-            <w:tcW w:w="2558" w:type="dxa"/>
+            <w:tcW w:w="2557" w:type="dxa"/>
             <w:tcBorders/>
             <w:vAlign w:val="center"/>
           </w:tcPr>
@@ -6784,7 +6095,7 @@
         </w:tc>
         <w:tc>
           <w:tcPr>
-            <w:tcW w:w="1259" w:type="dxa"/>
+            <w:tcW w:w="1260" w:type="dxa"/>
             <w:tcBorders/>
             <w:vAlign w:val="center"/>
           </w:tcPr>
@@ -6805,7 +6116,7 @@
         </w:tc>
         <w:tc>
           <w:tcPr>
-            <w:tcW w:w="4907" w:type="dxa"/>
+            <w:tcW w:w="4906" w:type="dxa"/>
             <w:tcBorders/>
             <w:vAlign w:val="center"/>
           </w:tcPr>
@@ -6829,7 +6140,7 @@
         <w:trPr/>
         <w:tc>
           <w:tcPr>
-            <w:tcW w:w="2558" w:type="dxa"/>
+            <w:tcW w:w="2557" w:type="dxa"/>
             <w:tcBorders/>
             <w:vAlign w:val="center"/>
           </w:tcPr>
@@ -6871,7 +6182,7 @@
         </w:tc>
         <w:tc>
           <w:tcPr>
-            <w:tcW w:w="1259" w:type="dxa"/>
+            <w:tcW w:w="1260" w:type="dxa"/>
             <w:tcBorders/>
             <w:vAlign w:val="center"/>
           </w:tcPr>
@@ -6892,7 +6203,7 @@
         </w:tc>
         <w:tc>
           <w:tcPr>
-            <w:tcW w:w="4907" w:type="dxa"/>
+            <w:tcW w:w="4906" w:type="dxa"/>
             <w:tcBorders/>
             <w:vAlign w:val="center"/>
           </w:tcPr>
@@ -6936,25 +6247,13 @@
         <w:jc w:val="start"/>
         <w:rPr/>
       </w:pPr>
-      <w:bookmarkStart w:id="26" w:name="__RefHeading___Toc278_879683452"/>
-      <w:bookmarkEnd w:id="26"/>
+      <w:bookmarkStart w:id="25" w:name="__RefHeading___Toc278_879683452"/>
+      <w:bookmarkEnd w:id="25"/>
       <w:r>
         <w:rPr>
           <w:rStyle w:val="StrongEmphasis"/>
         </w:rPr>
-        <w:t>1</w:t>
-      </w:r>
-      <w:r>
-        <w:rPr>
-          <w:rStyle w:val="StrongEmphasis"/>
-        </w:rPr>
-        <w:t>2</w:t>
-      </w:r>
-      <w:r>
-        <w:rPr>
-          <w:rStyle w:val="StrongEmphasis"/>
-        </w:rPr>
-        <w:t>. Dependencies</w:t>
+        <w:t>12. Dependencies</w:t>
       </w:r>
     </w:p>
     <w:p>
@@ -6962,10 +6261,9 @@
         <w:pStyle w:val="TextBody"/>
         <w:numPr>
           <w:ilvl w:val="0"/>
-          <w:numId w:val="25"/>
+          <w:numId w:val="24"/>
         </w:numPr>
         <w:tabs>
-          <w:tab w:val="clear" w:pos="709"/>
           <w:tab w:val="left" w:pos="709" w:leader="none"/>
         </w:tabs>
         <w:bidi w:val="0"/>
@@ -6983,10 +6281,9 @@
         <w:pStyle w:val="TextBody"/>
         <w:numPr>
           <w:ilvl w:val="0"/>
-          <w:numId w:val="25"/>
+          <w:numId w:val="24"/>
         </w:numPr>
         <w:tabs>
-          <w:tab w:val="clear" w:pos="709"/>
           <w:tab w:val="left" w:pos="709" w:leader="none"/>
         </w:tabs>
         <w:bidi w:val="0"/>
@@ -7011,10 +6308,9 @@
         <w:pStyle w:val="TextBody"/>
         <w:numPr>
           <w:ilvl w:val="0"/>
-          <w:numId w:val="25"/>
+          <w:numId w:val="24"/>
         </w:numPr>
         <w:tabs>
-          <w:tab w:val="clear" w:pos="709"/>
           <w:tab w:val="left" w:pos="709" w:leader="none"/>
         </w:tabs>
         <w:bidi w:val="0"/>
@@ -7032,10 +6328,9 @@
         <w:pStyle w:val="TextBody"/>
         <w:numPr>
           <w:ilvl w:val="0"/>
-          <w:numId w:val="25"/>
+          <w:numId w:val="24"/>
         </w:numPr>
         <w:tabs>
-          <w:tab w:val="clear" w:pos="709"/>
           <w:tab w:val="left" w:pos="709" w:leader="none"/>
         </w:tabs>
         <w:bidi w:val="0"/>
@@ -7053,10 +6348,9 @@
         <w:pStyle w:val="TextBody"/>
         <w:numPr>
           <w:ilvl w:val="0"/>
-          <w:numId w:val="25"/>
+          <w:numId w:val="24"/>
         </w:numPr>
         <w:tabs>
-          <w:tab w:val="clear" w:pos="709"/>
           <w:tab w:val="left" w:pos="709" w:leader="none"/>
         </w:tabs>
         <w:bidi w:val="0"/>
@@ -7086,269 +6380,185 @@
         <w:jc w:val="start"/>
         <w:rPr/>
       </w:pPr>
-      <w:bookmarkStart w:id="27" w:name="__RefHeading___Toc280_879683452"/>
+      <w:bookmarkStart w:id="26" w:name="__RefHeading___Toc280_879683452"/>
+      <w:bookmarkEnd w:id="26"/>
+      <w:r>
+        <w:rPr>
+          <w:rStyle w:val="StrongEmphasis"/>
+        </w:rPr>
+        <w:t>13. Appendix</w:t>
+      </w:r>
+    </w:p>
+    <w:p>
+      <w:pPr>
+        <w:pStyle w:val="Heading4"/>
+        <w:bidi w:val="0"/>
+        <w:jc w:val="start"/>
+        <w:rPr/>
+      </w:pPr>
+      <w:bookmarkStart w:id="27" w:name="__RefHeading___Toc282_879683452"/>
       <w:bookmarkEnd w:id="27"/>
       <w:r>
         <w:rPr>
           <w:rStyle w:val="StrongEmphasis"/>
         </w:rPr>
-        <w:t>1</w:t>
-      </w:r>
+        <w:t>A. Sample Search Terms Configuration</w:t>
+      </w:r>
+    </w:p>
+    <w:p>
+      <w:pPr>
+        <w:pStyle w:val="PreformattedText"/>
+        <w:bidi w:val="0"/>
+        <w:spacing w:before="0" w:after="0"/>
+        <w:jc w:val="start"/>
+        <w:rPr/>
+      </w:pPr>
+      <w:r>
+        <w:rPr>
+          <w:rStyle w:val="SourceText"/>
+        </w:rPr>
+        <w:t>search_terms:</w:t>
+      </w:r>
+    </w:p>
+    <w:p>
+      <w:pPr>
+        <w:pStyle w:val="PreformattedText"/>
+        <w:bidi w:val="0"/>
+        <w:spacing w:before="0" w:after="0"/>
+        <w:jc w:val="start"/>
+        <w:rPr/>
+      </w:pPr>
+      <w:r>
+        <w:rPr>
+          <w:rStyle w:val="SourceText"/>
+        </w:rPr>
+        <w:t xml:space="preserve">  </w:t>
+      </w:r>
+      <w:r>
+        <w:rPr>
+          <w:rStyle w:val="SourceText"/>
+        </w:rPr>
+        <w:t>- "Dragoslav Pavlović"</w:t>
+      </w:r>
+    </w:p>
+    <w:p>
+      <w:pPr>
+        <w:pStyle w:val="PreformattedText"/>
+        <w:bidi w:val="0"/>
+        <w:spacing w:before="0" w:after="0"/>
+        <w:jc w:val="start"/>
+        <w:rPr/>
+      </w:pPr>
+      <w:r>
+        <w:rPr>
+          <w:rStyle w:val="SourceText"/>
+        </w:rPr>
+        <w:t xml:space="preserve">  </w:t>
+      </w:r>
+      <w:r>
+        <w:rPr>
+          <w:rStyle w:val="SourceText"/>
+        </w:rPr>
+        <w:t>- "Gradonačelnik"</w:t>
+      </w:r>
+    </w:p>
+    <w:p>
+      <w:pPr>
+        <w:pStyle w:val="PreformattedText"/>
+        <w:bidi w:val="0"/>
+        <w:spacing w:before="0" w:after="0"/>
+        <w:jc w:val="start"/>
+        <w:rPr/>
+      </w:pPr>
+      <w:r>
+        <w:rPr>
+          <w:rStyle w:val="SourceText"/>
+        </w:rPr>
+        <w:t xml:space="preserve">  </w:t>
+      </w:r>
+      <w:r>
+        <w:rPr>
+          <w:rStyle w:val="SourceText"/>
+        </w:rPr>
+        <w:t>- "Gradonačelnik Niša"</w:t>
+      </w:r>
+    </w:p>
+    <w:p>
+      <w:pPr>
+        <w:pStyle w:val="PreformattedText"/>
+        <w:bidi w:val="0"/>
+        <w:spacing w:before="0" w:after="0"/>
+        <w:jc w:val="start"/>
+        <w:rPr/>
+      </w:pPr>
+      <w:r>
+        <w:rPr>
+          <w:rStyle w:val="SourceText"/>
+        </w:rPr>
+        <w:t xml:space="preserve">  </w:t>
+      </w:r>
+      <w:r>
+        <w:rPr>
+          <w:rStyle w:val="SourceText"/>
+        </w:rPr>
+        <w:t>- "Gradonačelnik grada Niša"</w:t>
+      </w:r>
+    </w:p>
+    <w:p>
+      <w:pPr>
+        <w:pStyle w:val="PreformattedText"/>
+        <w:bidi w:val="0"/>
+        <w:spacing w:before="0" w:after="0"/>
+        <w:jc w:val="start"/>
+        <w:rPr/>
+      </w:pPr>
+      <w:r>
+        <w:rPr>
+          <w:rStyle w:val="SourceText"/>
+        </w:rPr>
+        <w:t xml:space="preserve">  </w:t>
+      </w:r>
+      <w:r>
+        <w:rPr>
+          <w:rStyle w:val="SourceText"/>
+        </w:rPr>
+        <w:t>- “Gradska Kuća Niš”</w:t>
+      </w:r>
+    </w:p>
+    <w:p>
+      <w:pPr>
+        <w:pStyle w:val="PreformattedText"/>
+        <w:bidi w:val="0"/>
+        <w:spacing w:before="0" w:after="283"/>
+        <w:jc w:val="start"/>
+        <w:rPr/>
+      </w:pPr>
+      <w:r>
+        <w:rPr>
+          <w:rStyle w:val="SourceText"/>
+        </w:rPr>
+        <w:t xml:space="preserve">  </w:t>
+      </w:r>
+      <w:r>
+        <w:rPr>
+          <w:rStyle w:val="SourceText"/>
+        </w:rPr>
+        <w:t>- "Gradska kuća u Nišu"</w:t>
+      </w:r>
+    </w:p>
+    <w:p>
+      <w:pPr>
+        <w:pStyle w:val="Heading4"/>
+        <w:bidi w:val="0"/>
+        <w:jc w:val="start"/>
+        <w:rPr/>
+      </w:pPr>
+      <w:bookmarkStart w:id="28" w:name="__RefHeading___Toc284_879683452"/>
+      <w:bookmarkEnd w:id="28"/>
       <w:r>
         <w:rPr>
           <w:rStyle w:val="StrongEmphasis"/>
         </w:rPr>
-        <w:t>3</w:t>
-      </w:r>
-      <w:r>
-        <w:rPr>
-          <w:rStyle w:val="StrongEmphasis"/>
-        </w:rPr>
-        <w:t>. Appendix</w:t>
-      </w:r>
-    </w:p>
-    <w:p>
-      <w:pPr>
-        <w:pStyle w:val="Heading4"/>
-        <w:bidi w:val="0"/>
-        <w:jc w:val="start"/>
-        <w:rPr/>
-      </w:pPr>
-      <w:bookmarkStart w:id="28" w:name="__RefHeading___Toc282_879683452"/>
-      <w:bookmarkEnd w:id="28"/>
-      <w:r>
-        <w:rPr>
-          <w:rStyle w:val="StrongEmphasis"/>
-        </w:rPr>
-        <w:t>A. Sample Search Terms Configuration</w:t>
-      </w:r>
-    </w:p>
-    <w:p>
-      <w:pPr>
-        <w:pStyle w:val="PreformattedText"/>
-        <w:bidi w:val="0"/>
-        <w:spacing w:before="0" w:after="0"/>
-        <w:jc w:val="start"/>
-        <w:rPr/>
-      </w:pPr>
-      <w:r>
-        <w:rPr>
-          <w:rStyle w:val="SourceText"/>
-        </w:rPr>
-        <w:t>search_terms:</w:t>
-      </w:r>
-    </w:p>
-    <w:p>
-      <w:pPr>
-        <w:pStyle w:val="PreformattedText"/>
-        <w:bidi w:val="0"/>
-        <w:spacing w:before="0" w:after="0"/>
-        <w:jc w:val="start"/>
-        <w:rPr/>
-      </w:pPr>
-      <w:r>
-        <w:rPr>
-          <w:rStyle w:val="SourceText"/>
-        </w:rPr>
-        <w:t xml:space="preserve">  </w:t>
-      </w:r>
-      <w:r>
-        <w:rPr>
-          <w:rStyle w:val="SourceText"/>
-        </w:rPr>
-        <w:t>- "</w:t>
-      </w:r>
-      <w:r>
-        <w:rPr>
-          <w:rStyle w:val="SourceText"/>
-        </w:rPr>
-        <w:t>Dragoslav Pavlović</w:t>
-      </w:r>
-      <w:r>
-        <w:rPr>
-          <w:rStyle w:val="SourceText"/>
-        </w:rPr>
-        <w:t>"</w:t>
-      </w:r>
-    </w:p>
-    <w:p>
-      <w:pPr>
-        <w:pStyle w:val="PreformattedText"/>
-        <w:bidi w:val="0"/>
-        <w:spacing w:before="0" w:after="0"/>
-        <w:jc w:val="start"/>
-        <w:rPr/>
-      </w:pPr>
-      <w:r>
-        <w:rPr>
-          <w:rStyle w:val="SourceText"/>
-        </w:rPr>
-        <w:t xml:space="preserve">  </w:t>
-      </w:r>
-      <w:r>
-        <w:rPr>
-          <w:rStyle w:val="SourceText"/>
-        </w:rPr>
-        <w:t>- "</w:t>
-      </w:r>
-      <w:r>
-        <w:rPr>
-          <w:rStyle w:val="SourceText"/>
-        </w:rPr>
-        <w:t>Gradonačelnik</w:t>
-      </w:r>
-      <w:r>
-        <w:rPr>
-          <w:rStyle w:val="SourceText"/>
-        </w:rPr>
-        <w:t>"</w:t>
-      </w:r>
-    </w:p>
-    <w:p>
-      <w:pPr>
-        <w:pStyle w:val="PreformattedText"/>
-        <w:bidi w:val="0"/>
-        <w:spacing w:before="0" w:after="0"/>
-        <w:jc w:val="start"/>
-        <w:rPr/>
-      </w:pPr>
-      <w:r>
-        <w:rPr>
-          <w:rStyle w:val="SourceText"/>
-        </w:rPr>
-        <w:t xml:space="preserve">  </w:t>
-      </w:r>
-      <w:r>
-        <w:rPr>
-          <w:rStyle w:val="SourceText"/>
-        </w:rPr>
-        <w:t>- "</w:t>
-      </w:r>
-      <w:r>
-        <w:rPr>
-          <w:rStyle w:val="SourceText"/>
-        </w:rPr>
-        <w:t>Gradonačelnik Niša</w:t>
-      </w:r>
-      <w:r>
-        <w:rPr>
-          <w:rStyle w:val="SourceText"/>
-        </w:rPr>
-        <w:t>"</w:t>
-      </w:r>
-    </w:p>
-    <w:p>
-      <w:pPr>
-        <w:pStyle w:val="PreformattedText"/>
-        <w:bidi w:val="0"/>
-        <w:spacing w:before="0" w:after="0"/>
-        <w:jc w:val="start"/>
-        <w:rPr/>
-      </w:pPr>
-      <w:r>
-        <w:rPr>
-          <w:rStyle w:val="SourceText"/>
-        </w:rPr>
-        <w:t xml:space="preserve">  </w:t>
-      </w:r>
-      <w:r>
-        <w:rPr>
-          <w:rStyle w:val="SourceText"/>
-        </w:rPr>
-        <w:t>- "</w:t>
-      </w:r>
-      <w:r>
-        <w:rPr>
-          <w:rStyle w:val="SourceText"/>
-        </w:rPr>
-        <w:t>Gradonačelnik grada Niša</w:t>
-      </w:r>
-      <w:r>
-        <w:rPr>
-          <w:rStyle w:val="SourceText"/>
-        </w:rPr>
-        <w:t>"</w:t>
-      </w:r>
-    </w:p>
-    <w:p>
-      <w:pPr>
-        <w:pStyle w:val="PreformattedText"/>
-        <w:bidi w:val="0"/>
-        <w:spacing w:before="0" w:after="0"/>
-        <w:jc w:val="start"/>
-        <w:rPr/>
-      </w:pPr>
-      <w:r>
-        <w:rPr>
-          <w:rStyle w:val="SourceText"/>
-        </w:rPr>
-        <w:t xml:space="preserve">  </w:t>
-      </w:r>
-      <w:r>
-        <w:rPr>
-          <w:rStyle w:val="SourceText"/>
-        </w:rPr>
-        <w:t>- “</w:t>
-      </w:r>
-      <w:r>
-        <w:rPr>
-          <w:rStyle w:val="SourceText"/>
-        </w:rPr>
-        <w:t>Gradska Kuća Niš</w:t>
-      </w:r>
-      <w:r>
-        <w:rPr>
-          <w:rStyle w:val="SourceText"/>
-        </w:rPr>
-        <w:t>”</w:t>
-      </w:r>
-    </w:p>
-    <w:p>
-      <w:pPr>
-        <w:pStyle w:val="PreformattedText"/>
-        <w:bidi w:val="0"/>
-        <w:spacing w:before="0" w:after="283"/>
-        <w:jc w:val="start"/>
-        <w:rPr/>
-      </w:pPr>
-      <w:r>
-        <w:rPr>
-          <w:rStyle w:val="SourceText"/>
-        </w:rPr>
-        <w:t xml:space="preserve">  </w:t>
-      </w:r>
-      <w:r>
-        <w:rPr>
-          <w:rStyle w:val="SourceText"/>
-        </w:rPr>
-        <w:t>- "</w:t>
-      </w:r>
-      <w:r>
-        <w:rPr>
-          <w:rStyle w:val="SourceText"/>
-        </w:rPr>
-        <w:t>Gradska kuća u Nišu</w:t>
-      </w:r>
-      <w:r>
-        <w:rPr>
-          <w:rStyle w:val="SourceText"/>
-        </w:rPr>
-        <w:t>"</w:t>
-      </w:r>
-    </w:p>
-    <w:p>
-      <w:pPr>
-        <w:pStyle w:val="Heading4"/>
-        <w:bidi w:val="0"/>
-        <w:jc w:val="start"/>
-        <w:rPr/>
-      </w:pPr>
-      <w:bookmarkStart w:id="29" w:name="__RefHeading___Toc284_879683452"/>
-      <w:bookmarkEnd w:id="29"/>
-      <w:r>
-        <w:rPr>
-          <w:rStyle w:val="StrongEmphasis"/>
-        </w:rPr>
         <w:t>B. Sample Email Report Output</w:t>
       </w:r>
     </w:p>
@@ -7406,19 +6616,7 @@
         <w:rPr>
           <w:rStyle w:val="SourceText"/>
         </w:rPr>
-        <w:t xml:space="preserve">**Search Terms**: </w:t>
-      </w:r>
-      <w:r>
-        <w:rPr>
-          <w:rStyle w:val="SourceText"/>
-        </w:rPr>
-        <w:t>Media</w:t>
-      </w:r>
-      <w:r>
-        <w:rPr>
-          <w:rStyle w:val="SourceText"/>
-        </w:rPr>
-        <w:t xml:space="preserve"> XYZ, Product ABC, CEO John Doe  </w:t>
+        <w:t xml:space="preserve">**Search Terms**: Media XYZ, Product ABC, CEO John Doe  </w:t>
       </w:r>
     </w:p>
     <w:p>
@@ -7490,7 +6688,7 @@
         <w:rPr>
           <w:rStyle w:val="SourceText"/>
         </w:rPr>
-        <w:t>- **Total Items Found**: 23 articles, 45 social media posts</w:t>
+        <w:t>- **Total Items Found**: 23 articles</w:t>
       </w:r>
     </w:p>
     <w:p>
@@ -7630,6 +6828,7 @@
       <w:pgNumType w:fmt="decimal"/>
       <w:formProt w:val="false"/>
       <w:textDirection w:val="lrTb"/>
+      <w:docGrid w:type="default" w:linePitch="100" w:charSpace="0"/>
     </w:sectPr>
   </w:body>
 </w:document>
@@ -7651,15 +6850,15 @@
       </w:tblCellMar>
     </w:tblPr>
     <w:tblGrid>
-      <w:gridCol w:w="3240"/>
+      <w:gridCol w:w="3239"/>
       <w:gridCol w:w="3185"/>
-      <w:gridCol w:w="3220"/>
+      <w:gridCol w:w="3221"/>
     </w:tblGrid>
     <w:tr>
       <w:trPr/>
       <w:tc>
         <w:tcPr>
-          <w:tcW w:w="3240" w:type="dxa"/>
+          <w:tcW w:w="3239" w:type="dxa"/>
           <w:tcBorders>
             <w:top w:val="single" w:sz="2" w:space="0" w:color="000000"/>
           </w:tcBorders>
@@ -7667,6 +6866,7 @@
         <w:p>
           <w:pPr>
             <w:pStyle w:val="TableContents"/>
+            <w:widowControl w:val="false"/>
             <w:bidi w:val="0"/>
             <w:jc w:val="start"/>
             <w:rPr>
@@ -7674,40 +6874,6 @@
               <w:szCs w:val="20"/>
             </w:rPr>
           </w:pPr>
-          <w:r>
-            <w:rPr>
-              <w:sz w:val="20"/>
-              <w:szCs w:val="20"/>
-            </w:rPr>
-            <w:fldChar w:fldCharType="begin"/>
-          </w:r>
-          <w:r>
-            <w:rPr>
-              <w:sz w:val="20"/>
-              <w:szCs w:val="20"/>
-            </w:rPr>
-            <w:instrText xml:space="preserve"> AUTHOR </w:instrText>
-          </w:r>
-          <w:r>
-            <w:rPr>
-              <w:sz w:val="20"/>
-              <w:szCs w:val="20"/>
-            </w:rPr>
-            <w:fldChar w:fldCharType="separate"/>
-          </w:r>
-          <w:r>
-            <w:rPr>
-              <w:sz w:val="20"/>
-              <w:szCs w:val="20"/>
-            </w:rPr>
-          </w:r>
-          <w:r>
-            <w:rPr>
-              <w:sz w:val="20"/>
-              <w:szCs w:val="20"/>
-            </w:rPr>
-            <w:fldChar w:fldCharType="end"/>
-          </w:r>
           <w:r>
             <w:rPr>
               <w:sz w:val="20"/>
@@ -7753,6 +6919,7 @@
         <w:p>
           <w:pPr>
             <w:pStyle w:val="TableContents"/>
+            <w:widowControl w:val="false"/>
             <w:bidi w:val="0"/>
             <w:jc w:val="start"/>
             <w:rPr>
@@ -7789,6 +6956,7 @@
         <w:p>
           <w:pPr>
             <w:pStyle w:val="TableContents"/>
+            <w:widowControl w:val="false"/>
             <w:bidi w:val="0"/>
             <w:jc w:val="center"/>
             <w:rPr>
@@ -7829,7 +6997,7 @@
               <w:sz w:val="20"/>
               <w:szCs w:val="20"/>
             </w:rPr>
-            <w:t>11</w:t>
+            <w:t>10</w:t>
           </w:r>
           <w:r>
             <w:rPr>
@@ -7871,7 +7039,7 @@
               <w:sz w:val="20"/>
               <w:szCs w:val="20"/>
             </w:rPr>
-            <w:t>11</w:t>
+            <w:t>10</w:t>
           </w:r>
           <w:r>
             <w:rPr>
@@ -7884,7 +7052,7 @@
       </w:tc>
       <w:tc>
         <w:tcPr>
-          <w:tcW w:w="3220" w:type="dxa"/>
+          <w:tcW w:w="3221" w:type="dxa"/>
           <w:tcBorders>
             <w:top w:val="single" w:sz="2" w:space="0" w:color="000000"/>
           </w:tcBorders>
@@ -7892,6 +7060,7 @@
         <w:p>
           <w:pPr>
             <w:pStyle w:val="TableContents"/>
+            <w:widowControl w:val="false"/>
             <w:bidi w:val="0"/>
             <w:jc w:val="end"/>
             <w:rPr>
@@ -7900,38 +7069,23 @@
             </w:rPr>
           </w:pPr>
           <w:r>
-            <w:rPr>
-              <w:sz w:val="20"/>
-              <w:szCs w:val="20"/>
-            </w:rPr>
+            <w:rPr/>
             <w:fldChar w:fldCharType="begin" w:fldLock="true"/>
           </w:r>
           <w:r>
-            <w:rPr>
-              <w:sz w:val="20"/>
-              <w:szCs w:val="20"/>
-            </w:rPr>
+            <w:rPr/>
             <w:instrText xml:space="preserve"> DATE \@"MMMM\ d', 'yyyy" </w:instrText>
           </w:r>
           <w:r>
-            <w:rPr>
-              <w:sz w:val="20"/>
-              <w:szCs w:val="20"/>
-            </w:rPr>
+            <w:rPr/>
             <w:fldChar w:fldCharType="separate"/>
           </w:r>
           <w:r>
-            <w:rPr>
-              <w:sz w:val="20"/>
-              <w:szCs w:val="20"/>
-            </w:rPr>
+            <w:rPr/>
             <w:t>January 17, 2026</w:t>
           </w:r>
           <w:r>
-            <w:rPr>
-              <w:sz w:val="20"/>
-              <w:szCs w:val="20"/>
-            </w:rPr>
+            <w:rPr/>
             <w:fldChar w:fldCharType="end"/>
           </w:r>
         </w:p>
@@ -7957,7 +7111,6 @@
   <w:abstractNum w:abstractNumId="1">
     <w:lvl w:ilvl="0">
       <w:start w:val="1"/>
-      <w:pStyle w:val="Heading1"/>
       <w:numFmt w:val="decimal"/>
       <w:lvlText w:val="%1."/>
       <w:lvlJc w:val="start"/>
@@ -7971,7 +7124,6 @@
     </w:lvl>
     <w:lvl w:ilvl="1">
       <w:start w:val="1"/>
-      <w:pStyle w:val="Heading2"/>
       <w:numFmt w:val="decimal"/>
       <w:lvlText w:val="%1.%2"/>
       <w:lvlJc w:val="start"/>
@@ -7985,7 +7137,6 @@
     </w:lvl>
     <w:lvl w:ilvl="2">
       <w:start w:val="1"/>
-      <w:pStyle w:val="Heading3"/>
       <w:numFmt w:val="none"/>
       <w:suff w:val="nothing"/>
       <w:lvlText w:val=""/>
@@ -7996,10 +7147,10 @@
         </w:tabs>
         <w:ind w:start="0" w:hanging="0"/>
       </w:pPr>
+      <w:rPr/>
     </w:lvl>
     <w:lvl w:ilvl="3">
       <w:start w:val="1"/>
-      <w:pStyle w:val="Heading4"/>
       <w:numFmt w:val="none"/>
       <w:suff w:val="nothing"/>
       <w:lvlText w:val=""/>
@@ -8010,6 +7161,7 @@
         </w:tabs>
         <w:ind w:start="0" w:hanging="0"/>
       </w:pPr>
+      <w:rPr/>
     </w:lvl>
     <w:lvl w:ilvl="4">
       <w:start w:val="1"/>
@@ -8023,6 +7175,7 @@
         </w:tabs>
         <w:ind w:start="0" w:hanging="0"/>
       </w:pPr>
+      <w:rPr/>
     </w:lvl>
     <w:lvl w:ilvl="5">
       <w:start w:val="1"/>
@@ -8036,6 +7189,7 @@
         </w:tabs>
         <w:ind w:start="0" w:hanging="0"/>
       </w:pPr>
+      <w:rPr/>
     </w:lvl>
     <w:lvl w:ilvl="6">
       <w:start w:val="1"/>
@@ -8049,6 +7203,7 @@
         </w:tabs>
         <w:ind w:start="0" w:hanging="0"/>
       </w:pPr>
+      <w:rPr/>
     </w:lvl>
     <w:lvl w:ilvl="7">
       <w:start w:val="1"/>
@@ -8062,6 +7217,7 @@
         </w:tabs>
         <w:ind w:start="0" w:hanging="0"/>
       </w:pPr>
+      <w:rPr/>
     </w:lvl>
     <w:lvl w:ilvl="8">
       <w:start w:val="1"/>
@@ -8075,6 +7231,7 @@
         </w:tabs>
         <w:ind w:start="0" w:hanging="0"/>
       </w:pPr>
+      <w:rPr/>
     </w:lvl>
   </w:abstractNum>
   <w:abstractNum w:abstractNumId="2">
@@ -11236,9 +10393,9 @@
       <w:lvlJc w:val="start"/>
       <w:pPr>
         <w:tabs>
-          <w:tab w:val="num" w:pos="709"/>
-        </w:tabs>
-        <w:ind w:start="709" w:hanging="283"/>
+          <w:tab w:val="num" w:pos="720"/>
+        </w:tabs>
+        <w:ind w:start="720" w:hanging="360"/>
       </w:pPr>
       <w:rPr>
         <w:rFonts w:ascii="Symbol" w:hAnsi="Symbol" w:cs="Symbol" w:hint="default"/>
@@ -11251,9 +10408,9 @@
       <w:lvlJc w:val="start"/>
       <w:pPr>
         <w:tabs>
-          <w:tab w:val="num" w:pos="1418"/>
-        </w:tabs>
-        <w:ind w:start="1418" w:hanging="283"/>
+          <w:tab w:val="num" w:pos="1080"/>
+        </w:tabs>
+        <w:ind w:start="1080" w:hanging="360"/>
       </w:pPr>
       <w:rPr>
         <w:rFonts w:ascii="Symbol" w:hAnsi="Symbol" w:cs="Symbol" w:hint="default"/>
@@ -11266,9 +10423,9 @@
       <w:lvlJc w:val="start"/>
       <w:pPr>
         <w:tabs>
-          <w:tab w:val="num" w:pos="2127"/>
-        </w:tabs>
-        <w:ind w:start="2127" w:hanging="283"/>
+          <w:tab w:val="num" w:pos="1440"/>
+        </w:tabs>
+        <w:ind w:start="1440" w:hanging="360"/>
       </w:pPr>
       <w:rPr>
         <w:rFonts w:ascii="Symbol" w:hAnsi="Symbol" w:cs="Symbol" w:hint="default"/>
@@ -11281,9 +10438,9 @@
       <w:lvlJc w:val="start"/>
       <w:pPr>
         <w:tabs>
-          <w:tab w:val="num" w:pos="2836"/>
-        </w:tabs>
-        <w:ind w:start="2836" w:hanging="283"/>
+          <w:tab w:val="num" w:pos="1800"/>
+        </w:tabs>
+        <w:ind w:start="1800" w:hanging="360"/>
       </w:pPr>
       <w:rPr>
         <w:rFonts w:ascii="Symbol" w:hAnsi="Symbol" w:cs="Symbol" w:hint="default"/>
@@ -11296,9 +10453,9 @@
       <w:lvlJc w:val="start"/>
       <w:pPr>
         <w:tabs>
-          <w:tab w:val="num" w:pos="3545"/>
-        </w:tabs>
-        <w:ind w:start="3545" w:hanging="283"/>
+          <w:tab w:val="num" w:pos="2160"/>
+        </w:tabs>
+        <w:ind w:start="2160" w:hanging="360"/>
       </w:pPr>
       <w:rPr>
         <w:rFonts w:ascii="Symbol" w:hAnsi="Symbol" w:cs="Symbol" w:hint="default"/>
@@ -11311,9 +10468,9 @@
       <w:lvlJc w:val="start"/>
       <w:pPr>
         <w:tabs>
-          <w:tab w:val="num" w:pos="4254"/>
-        </w:tabs>
-        <w:ind w:start="4254" w:hanging="283"/>
+          <w:tab w:val="num" w:pos="2520"/>
+        </w:tabs>
+        <w:ind w:start="2520" w:hanging="360"/>
       </w:pPr>
       <w:rPr>
         <w:rFonts w:ascii="Symbol" w:hAnsi="Symbol" w:cs="Symbol" w:hint="default"/>
@@ -11326,9 +10483,9 @@
       <w:lvlJc w:val="start"/>
       <w:pPr>
         <w:tabs>
-          <w:tab w:val="num" w:pos="4963"/>
-        </w:tabs>
-        <w:ind w:start="4963" w:hanging="283"/>
+          <w:tab w:val="num" w:pos="2880"/>
+        </w:tabs>
+        <w:ind w:start="2880" w:hanging="360"/>
       </w:pPr>
       <w:rPr>
         <w:rFonts w:ascii="Symbol" w:hAnsi="Symbol" w:cs="Symbol" w:hint="default"/>
@@ -11341,9 +10498,9 @@
       <w:lvlJc w:val="start"/>
       <w:pPr>
         <w:tabs>
-          <w:tab w:val="num" w:pos="5672"/>
-        </w:tabs>
-        <w:ind w:start="5672" w:hanging="283"/>
+          <w:tab w:val="num" w:pos="3240"/>
+        </w:tabs>
+        <w:ind w:start="3240" w:hanging="360"/>
       </w:pPr>
       <w:rPr>
         <w:rFonts w:ascii="Symbol" w:hAnsi="Symbol" w:cs="Symbol" w:hint="default"/>
@@ -11356,9 +10513,9 @@
       <w:lvlJc w:val="start"/>
       <w:pPr>
         <w:tabs>
-          <w:tab w:val="num" w:pos="6381"/>
-        </w:tabs>
-        <w:ind w:start="6381" w:hanging="283"/>
+          <w:tab w:val="num" w:pos="3600"/>
+        </w:tabs>
+        <w:ind w:start="3600" w:hanging="360"/>
       </w:pPr>
       <w:rPr>
         <w:rFonts w:ascii="Symbol" w:hAnsi="Symbol" w:cs="Symbol" w:hint="default"/>
@@ -11510,9 +10667,9 @@
       <w:lvlJc w:val="start"/>
       <w:pPr>
         <w:tabs>
-          <w:tab w:val="num" w:pos="720"/>
-        </w:tabs>
-        <w:ind w:start="720" w:hanging="360"/>
+          <w:tab w:val="num" w:pos="709"/>
+        </w:tabs>
+        <w:ind w:start="709" w:hanging="283"/>
       </w:pPr>
       <w:rPr>
         <w:rFonts w:ascii="Symbol" w:hAnsi="Symbol" w:cs="Symbol" w:hint="default"/>
@@ -11525,9 +10682,9 @@
       <w:lvlJc w:val="start"/>
       <w:pPr>
         <w:tabs>
-          <w:tab w:val="num" w:pos="1080"/>
-        </w:tabs>
-        <w:ind w:start="1080" w:hanging="360"/>
+          <w:tab w:val="num" w:pos="1418"/>
+        </w:tabs>
+        <w:ind w:start="1418" w:hanging="283"/>
       </w:pPr>
       <w:rPr>
         <w:rFonts w:ascii="Symbol" w:hAnsi="Symbol" w:cs="Symbol" w:hint="default"/>
@@ -11540,9 +10697,9 @@
       <w:lvlJc w:val="start"/>
       <w:pPr>
         <w:tabs>
-          <w:tab w:val="num" w:pos="1440"/>
-        </w:tabs>
-        <w:ind w:start="1440" w:hanging="360"/>
+          <w:tab w:val="num" w:pos="2127"/>
+        </w:tabs>
+        <w:ind w:start="2127" w:hanging="283"/>
       </w:pPr>
       <w:rPr>
         <w:rFonts w:ascii="Symbol" w:hAnsi="Symbol" w:cs="Symbol" w:hint="default"/>
@@ -11555,9 +10712,9 @@
       <w:lvlJc w:val="start"/>
       <w:pPr>
         <w:tabs>
-          <w:tab w:val="num" w:pos="1800"/>
-        </w:tabs>
-        <w:ind w:start="1800" w:hanging="360"/>
+          <w:tab w:val="num" w:pos="2836"/>
+        </w:tabs>
+        <w:ind w:start="2836" w:hanging="283"/>
       </w:pPr>
       <w:rPr>
         <w:rFonts w:ascii="Symbol" w:hAnsi="Symbol" w:cs="Symbol" w:hint="default"/>
@@ -11570,9 +10727,9 @@
       <w:lvlJc w:val="start"/>
       <w:pPr>
         <w:tabs>
-          <w:tab w:val="num" w:pos="2160"/>
-        </w:tabs>
-        <w:ind w:start="2160" w:hanging="360"/>
+          <w:tab w:val="num" w:pos="3545"/>
+        </w:tabs>
+        <w:ind w:start="3545" w:hanging="283"/>
       </w:pPr>
       <w:rPr>
         <w:rFonts w:ascii="Symbol" w:hAnsi="Symbol" w:cs="Symbol" w:hint="default"/>
@@ -11585,9 +10742,9 @@
       <w:lvlJc w:val="start"/>
       <w:pPr>
         <w:tabs>
-          <w:tab w:val="num" w:pos="2520"/>
-        </w:tabs>
-        <w:ind w:start="2520" w:hanging="360"/>
+          <w:tab w:val="num" w:pos="4254"/>
+        </w:tabs>
+        <w:ind w:start="4254" w:hanging="283"/>
       </w:pPr>
       <w:rPr>
         <w:rFonts w:ascii="Symbol" w:hAnsi="Symbol" w:cs="Symbol" w:hint="default"/>
@@ -11600,9 +10757,9 @@
       <w:lvlJc w:val="start"/>
       <w:pPr>
         <w:tabs>
-          <w:tab w:val="num" w:pos="2880"/>
-        </w:tabs>
-        <w:ind w:start="2880" w:hanging="360"/>
+          <w:tab w:val="num" w:pos="4963"/>
+        </w:tabs>
+        <w:ind w:start="4963" w:hanging="283"/>
       </w:pPr>
       <w:rPr>
         <w:rFonts w:ascii="Symbol" w:hAnsi="Symbol" w:cs="Symbol" w:hint="default"/>
@@ -11615,9 +10772,9 @@
       <w:lvlJc w:val="start"/>
       <w:pPr>
         <w:tabs>
-          <w:tab w:val="num" w:pos="3240"/>
-        </w:tabs>
-        <w:ind w:start="3240" w:hanging="360"/>
+          <w:tab w:val="num" w:pos="5672"/>
+        </w:tabs>
+        <w:ind w:start="5672" w:hanging="283"/>
       </w:pPr>
       <w:rPr>
         <w:rFonts w:ascii="Symbol" w:hAnsi="Symbol" w:cs="Symbol" w:hint="default"/>
@@ -11630,9 +10787,9 @@
       <w:lvlJc w:val="start"/>
       <w:pPr>
         <w:tabs>
-          <w:tab w:val="num" w:pos="3600"/>
-        </w:tabs>
-        <w:ind w:start="3600" w:hanging="360"/>
+          <w:tab w:val="num" w:pos="6381"/>
+        </w:tabs>
+        <w:ind w:start="6381" w:hanging="283"/>
       </w:pPr>
       <w:rPr>
         <w:rFonts w:ascii="Symbol" w:hAnsi="Symbol" w:cs="Symbol" w:hint="default"/>
@@ -11916,138 +11073,120 @@
   <w:abstractNum w:abstractNumId="30">
     <w:lvl w:ilvl="0">
       <w:start w:val="1"/>
-      <w:numFmt w:val="bullet"/>
-      <w:lvlText w:val=""/>
-      <w:lvlJc w:val="start"/>
-      <w:pPr>
-        <w:tabs>
-          <w:tab w:val="num" w:pos="709"/>
-        </w:tabs>
-        <w:ind w:start="709" w:hanging="283"/>
-      </w:pPr>
-      <w:rPr>
-        <w:rFonts w:ascii="Symbol" w:hAnsi="Symbol" w:cs="Symbol" w:hint="default"/>
-      </w:rPr>
+      <w:numFmt w:val="none"/>
+      <w:suff w:val="nothing"/>
+      <w:lvlText w:val=""/>
+      <w:lvlJc w:val="start"/>
+      <w:pPr>
+        <w:tabs>
+          <w:tab w:val="num" w:pos="0"/>
+        </w:tabs>
+        <w:ind w:start="0" w:hanging="0"/>
+      </w:pPr>
     </w:lvl>
     <w:lvl w:ilvl="1">
       <w:start w:val="1"/>
-      <w:numFmt w:val="bullet"/>
-      <w:lvlText w:val=""/>
-      <w:lvlJc w:val="start"/>
-      <w:pPr>
-        <w:tabs>
-          <w:tab w:val="num" w:pos="1418"/>
-        </w:tabs>
-        <w:ind w:start="1418" w:hanging="283"/>
-      </w:pPr>
-      <w:rPr>
-        <w:rFonts w:ascii="Symbol" w:hAnsi="Symbol" w:cs="Symbol" w:hint="default"/>
-      </w:rPr>
+      <w:numFmt w:val="none"/>
+      <w:suff w:val="nothing"/>
+      <w:lvlText w:val=""/>
+      <w:lvlJc w:val="start"/>
+      <w:pPr>
+        <w:tabs>
+          <w:tab w:val="num" w:pos="0"/>
+        </w:tabs>
+        <w:ind w:start="0" w:hanging="0"/>
+      </w:pPr>
     </w:lvl>
     <w:lvl w:ilvl="2">
       <w:start w:val="1"/>
-      <w:numFmt w:val="bullet"/>
-      <w:lvlText w:val=""/>
-      <w:lvlJc w:val="start"/>
-      <w:pPr>
-        <w:tabs>
-          <w:tab w:val="num" w:pos="2127"/>
-        </w:tabs>
-        <w:ind w:start="2127" w:hanging="283"/>
-      </w:pPr>
-      <w:rPr>
-        <w:rFonts w:ascii="Symbol" w:hAnsi="Symbol" w:cs="Symbol" w:hint="default"/>
-      </w:rPr>
+      <w:numFmt w:val="none"/>
+      <w:suff w:val="nothing"/>
+      <w:lvlText w:val=""/>
+      <w:lvlJc w:val="start"/>
+      <w:pPr>
+        <w:tabs>
+          <w:tab w:val="num" w:pos="0"/>
+        </w:tabs>
+        <w:ind w:start="0" w:hanging="0"/>
+      </w:pPr>
     </w:lvl>
     <w:lvl w:ilvl="3">
       <w:start w:val="1"/>
-      <w:numFmt w:val="bullet"/>
-      <w:lvlText w:val=""/>
-      <w:lvlJc w:val="start"/>
-      <w:pPr>
-        <w:tabs>
-          <w:tab w:val="num" w:pos="2836"/>
-        </w:tabs>
-        <w:ind w:start="2836" w:hanging="283"/>
-      </w:pPr>
-      <w:rPr>
-        <w:rFonts w:ascii="Symbol" w:hAnsi="Symbol" w:cs="Symbol" w:hint="default"/>
-      </w:rPr>
+      <w:numFmt w:val="none"/>
+      <w:suff w:val="nothing"/>
+      <w:lvlText w:val=""/>
+      <w:lvlJc w:val="start"/>
+      <w:pPr>
+        <w:tabs>
+          <w:tab w:val="num" w:pos="0"/>
+        </w:tabs>
+        <w:ind w:start="0" w:hanging="0"/>
+      </w:pPr>
     </w:lvl>
     <w:lvl w:ilvl="4">
       <w:start w:val="1"/>
-      <w:numFmt w:val="bullet"/>
-      <w:lvlText w:val=""/>
-      <w:lvlJc w:val="start"/>
-      <w:pPr>
-        <w:tabs>
-          <w:tab w:val="num" w:pos="3545"/>
-        </w:tabs>
-        <w:ind w:start="3545" w:hanging="283"/>
-      </w:pPr>
-      <w:rPr>
-        <w:rFonts w:ascii="Symbol" w:hAnsi="Symbol" w:cs="Symbol" w:hint="default"/>
-      </w:rPr>
+      <w:numFmt w:val="none"/>
+      <w:suff w:val="nothing"/>
+      <w:lvlText w:val=""/>
+      <w:lvlJc w:val="start"/>
+      <w:pPr>
+        <w:tabs>
+          <w:tab w:val="num" w:pos="0"/>
+        </w:tabs>
+        <w:ind w:start="0" w:hanging="0"/>
+      </w:pPr>
     </w:lvl>
     <w:lvl w:ilvl="5">
       <w:start w:val="1"/>
-      <w:numFmt w:val="bullet"/>
-      <w:lvlText w:val=""/>
-      <w:lvlJc w:val="start"/>
-      <w:pPr>
-        <w:tabs>
-          <w:tab w:val="num" w:pos="4254"/>
-        </w:tabs>
-        <w:ind w:start="4254" w:hanging="283"/>
-      </w:pPr>
-      <w:rPr>
-        <w:rFonts w:ascii="Symbol" w:hAnsi="Symbol" w:cs="Symbol" w:hint="default"/>
-      </w:rPr>
+      <w:numFmt w:val="none"/>
+      <w:suff w:val="nothing"/>
+      <w:lvlText w:val=""/>
+      <w:lvlJc w:val="start"/>
+      <w:pPr>
+        <w:tabs>
+          <w:tab w:val="num" w:pos="0"/>
+        </w:tabs>
+        <w:ind w:start="0" w:hanging="0"/>
+      </w:pPr>
     </w:lvl>
     <w:lvl w:ilvl="6">
       <w:start w:val="1"/>
-      <w:numFmt w:val="bullet"/>
-      <w:lvlText w:val=""/>
-      <w:lvlJc w:val="start"/>
-      <w:pPr>
-        <w:tabs>
-          <w:tab w:val="num" w:pos="4963"/>
-        </w:tabs>
-        <w:ind w:start="4963" w:hanging="283"/>
-      </w:pPr>
-      <w:rPr>
-        <w:rFonts w:ascii="Symbol" w:hAnsi="Symbol" w:cs="Symbol" w:hint="default"/>
-      </w:rPr>
+      <w:numFmt w:val="none"/>
+      <w:suff w:val="nothing"/>
+      <w:lvlText w:val=""/>
+      <w:lvlJc w:val="start"/>
+      <w:pPr>
+        <w:tabs>
+          <w:tab w:val="num" w:pos="0"/>
+        </w:tabs>
+        <w:ind w:start="0" w:hanging="0"/>
+      </w:pPr>
     </w:lvl>
     <w:lvl w:ilvl="7">
       <w:start w:val="1"/>
-      <w:numFmt w:val="bullet"/>
-      <w:lvlText w:val=""/>
-      <w:lvlJc w:val="start"/>
-      <w:pPr>
-        <w:tabs>
-          <w:tab w:val="num" w:pos="5672"/>
-        </w:tabs>
-        <w:ind w:start="5672" w:hanging="283"/>
-      </w:pPr>
-      <w:rPr>
-        <w:rFonts w:ascii="Symbol" w:hAnsi="Symbol" w:cs="Symbol" w:hint="default"/>
-      </w:rPr>
+      <w:numFmt w:val="none"/>
+      <w:suff w:val="nothing"/>
+      <w:lvlText w:val=""/>
+      <w:lvlJc w:val="start"/>
+      <w:pPr>
+        <w:tabs>
+          <w:tab w:val="num" w:pos="0"/>
+        </w:tabs>
+        <w:ind w:start="0" w:hanging="0"/>
+      </w:pPr>
     </w:lvl>
     <w:lvl w:ilvl="8">
       <w:start w:val="1"/>
-      <w:numFmt w:val="bullet"/>
-      <w:lvlText w:val=""/>
-      <w:lvlJc w:val="start"/>
-      <w:pPr>
-        <w:tabs>
-          <w:tab w:val="num" w:pos="6381"/>
-        </w:tabs>
-        <w:ind w:start="6381" w:hanging="283"/>
-      </w:pPr>
-      <w:rPr>
-        <w:rFonts w:ascii="Symbol" w:hAnsi="Symbol" w:cs="Symbol" w:hint="default"/>
-      </w:rPr>
+      <w:numFmt w:val="none"/>
+      <w:suff w:val="nothing"/>
+      <w:lvlText w:val=""/>
+      <w:lvlJc w:val="start"/>
+      <w:pPr>
+        <w:tabs>
+          <w:tab w:val="num" w:pos="0"/>
+        </w:tabs>
+        <w:ind w:start="0" w:hanging="0"/>
+      </w:pPr>
     </w:lvl>
   </w:abstractNum>
   <w:num w:numId="1">
@@ -12141,7 +11280,7 @@
     <w:abstractNumId w:val="30"/>
   </w:num>
   <w:num w:numId="31">
-    <w:abstractNumId w:val="27"/>
+    <w:abstractNumId w:val="26"/>
     <w:lvlOverride w:ilvl="0">
       <w:lvl w:ilvl="0">
         <w:start w:val="1"/>
@@ -12321,7 +11460,6 @@
     </w:rPrDefault>
     <w:pPrDefault>
       <w:pPr>
-        <w:widowControl/>
         <w:suppressAutoHyphens w:val="true"/>
       </w:pPr>
     </w:pPrDefault>
@@ -12331,7 +11469,10 @@
     <w:qFormat/>
     <w:pPr>
       <w:widowControl/>
+      <w:suppressAutoHyphens w:val="true"/>
       <w:bidi w:val="0"/>
+      <w:spacing w:before="0" w:after="0"/>
+      <w:jc w:val="start"/>
     </w:pPr>
     <w:rPr>
       <w:rFonts w:ascii="Liberation Serif" w:hAnsi="Liberation Serif" w:eastAsia="Noto Serif CJK SC" w:cs="Lohit Devanagari"/>
@@ -12644,7 +11785,8 @@
       <w:ind w:start="0" w:hanging="0"/>
     </w:pPr>
     <w:rPr>
-      <w:b/>
+      <w:rFonts w:ascii="FreeSans" w:hAnsi="FreeSans"/>
+      <w:b w:val="false"/>
       <w:bCs/>
       <w:sz w:val="32"/>
       <w:szCs w:val="32"/>
@@ -12672,7 +11814,9 @@
       </w:tabs>
       <w:ind w:start="567" w:hanging="0"/>
     </w:pPr>
-    <w:rPr/>
+    <w:rPr>
+      <w:rFonts w:ascii="FreeSans" w:hAnsi="FreeSans"/>
+    </w:rPr>
   </w:style>
   <w:style w:type="paragraph" w:styleId="Contents4">
     <w:name w:val="TOC 4"/>
@@ -12684,7 +11828,9 @@
       </w:tabs>
       <w:ind w:start="850" w:hanging="0"/>
     </w:pPr>
-    <w:rPr/>
+    <w:rPr>
+      <w:rFonts w:ascii="FreeSans" w:hAnsi="FreeSans"/>
+    </w:rPr>
   </w:style>
   <w:style w:type="paragraph" w:styleId="Contents7">
     <w:name w:val="TOC 7"/>

</xml_diff>